<commit_message>
v5.0.0: compact Settings → Team layout at 1366px, simple upgrade steps for 1.4, change summary, reset confirmation must be typed
Co-Authored-By: Claude Opus 5.5 <noreply@anthropic.com>
Claude-Session: https://claude.ai/code/session_014y1MJU3GKp2dkeyoic78UT
</commit_message>
<xml_diff>
--- a/one-to-one/ESG-1to1-Simple-Upgrade-Steps.docx
+++ b/one-to-one/ESG-1to1-Simple-Upgrade-Steps.docx
@@ -12,18 +12,88 @@
     </w:p>
     <w:p>
       <w:r>
-        <w:t>This puts the new version live: the clearer forms, the words instead of scores, the "focus on" list and the challenge feature.</w:t>
-      </w:r>
-    </w:p>
-    <w:p>
+        <w:t xml:space="preserve">This puts version </w:t>
+      </w:r>
       <w:r>
         <w:rPr>
           <w:b/>
         </w:rPr>
-        <w:t>It takes about 30 minutes.</w:t>
+        <w:t>5.0.0</w:t>
+      </w:r>
+      <w:r>
+        <w:t xml:space="preserve"> live. Here is what it brings:</w:t>
+      </w:r>
+    </w:p>
+    <w:p>
+      <w:pPr>
+        <w:pStyle w:val="ListBullet"/>
+      </w:pPr>
+      <w:r>
+        <w:t>appraisal periods that follow the real appraisal dates;</w:t>
+      </w:r>
+    </w:p>
+    <w:p>
+      <w:pPr>
+        <w:pStyle w:val="ListBullet"/>
+      </w:pPr>
+      <w:r>
+        <w:t>missed months no longer count against anyone;</w:t>
+      </w:r>
+    </w:p>
+    <w:p>
+      <w:pPr>
+        <w:pStyle w:val="ListBullet"/>
+      </w:pPr>
+      <w:r>
+        <w:t>you can amend a 1-to-1 with a reason, and the person is told;</w:t>
+      </w:r>
+    </w:p>
+    <w:p>
+      <w:pPr>
+        <w:pStyle w:val="ListBullet"/>
+      </w:pPr>
+      <w:r>
+        <w:t>next wellbeing dates are set in Settings;</w:t>
+      </w:r>
+    </w:p>
+    <w:p>
+      <w:pPr>
+        <w:pStyle w:val="ListBullet"/>
+      </w:pPr>
+      <w:r>
+        <w:t>no limit on expectations;</w:t>
+      </w:r>
+    </w:p>
+    <w:p>
+      <w:pPr>
+        <w:pStyle w:val="ListBullet"/>
+      </w:pPr>
+      <w:r>
+        <w:t>a tidier screen.</w:t>
+      </w:r>
+    </w:p>
+    <w:p>
+      <w:r>
+        <w:t>The old "challenge" feature is removed. Its records are kept.</w:t>
+      </w:r>
+    </w:p>
+    <w:p>
+      <w:r>
+        <w:rPr>
+          <w:b/>
+        </w:rPr>
+        <w:t>It takes about 45 minutes.</w:t>
       </w:r>
       <w:r>
         <w:t xml:space="preserve"> Do it in one go, at a quiet time. Nobody loses any data.</w:t>
+      </w:r>
+    </w:p>
+    <w:p>
+      <w:r>
+        <w:rPr>
+          <w:b/>
+        </w:rPr>
+        <w:t>Only do this once you have approval to change the live site.</w:t>
       </w:r>
     </w:p>
     <w:p>
@@ -62,7 +132,7 @@
         <w:rPr>
           <w:b/>
         </w:rPr>
-        <w:t>ESGOneToOne_1_3_0_0_unmanaged.zip</w:t>
+        <w:t>ESGOneToOne_1_4_0_0_unmanaged.zip</w:t>
       </w:r>
       <w:r>
         <w:t xml:space="preserve"> – the "behind the scenes" part</w:t>
@@ -161,7 +231,7 @@
         <w:rPr>
           <w:color w:val="13516B"/>
         </w:rPr>
-        <w:t>Part 1 – Install the new version (10 minutes)</w:t>
+        <w:t>Part 1 – Make a safety copy (10 minutes)</w:t>
       </w:r>
     </w:p>
     <w:p>
@@ -175,13 +245,31 @@
         <w:t xml:space="preserve">☐ 1.  </w:t>
       </w:r>
       <w:r>
-        <w:t xml:space="preserve">Open your web browser and go to </w:t>
+        <w:t xml:space="preserve">Go to your </w:t>
       </w:r>
       <w:r>
         <w:rPr>
           <w:b/>
         </w:rPr>
-        <w:t>make.powerautomate.com</w:t>
+        <w:t>1-to-1 SharePoint site</w:t>
+      </w:r>
+      <w:r>
+        <w:t xml:space="preserve">. Click the </w:t>
+      </w:r>
+      <w:r>
+        <w:rPr>
+          <w:b/>
+        </w:rPr>
+        <w:t>gear icon ⚙</w:t>
+      </w:r>
+      <w:r>
+        <w:t xml:space="preserve"> (top right), then </w:t>
+      </w:r>
+      <w:r>
+        <w:rPr>
+          <w:b/>
+        </w:rPr>
+        <w:t>Site contents</w:t>
       </w:r>
       <w:r>
         <w:t>.</w:t>
@@ -198,16 +286,16 @@
         <w:t xml:space="preserve">☐ 2.  </w:t>
       </w:r>
       <w:r>
-        <w:t xml:space="preserve">On the left-hand side, click </w:t>
+        <w:t xml:space="preserve">Open each of these lists in turn, and click </w:t>
       </w:r>
       <w:r>
         <w:rPr>
           <w:b/>
         </w:rPr>
-        <w:t>Solutions</w:t>
-      </w:r>
-      <w:r>
-        <w:t>.</w:t>
+        <w:t>Export → Export to CSV</w:t>
+      </w:r>
+      <w:r>
+        <w:t>:</w:t>
       </w:r>
     </w:p>
     <w:p>
@@ -215,25 +303,55 @@
         <w:pStyle w:val="ListBullet2"/>
       </w:pPr>
       <w:r>
-        <w:t xml:space="preserve">If you can't see it, click </w:t>
-      </w:r>
-      <w:r>
-        <w:rPr>
-          <w:b/>
-        </w:rPr>
-        <w:t>More</w:t>
-      </w:r>
-      <w:r>
-        <w:t xml:space="preserve"> first, then </w:t>
-      </w:r>
-      <w:r>
-        <w:rPr>
-          <w:b/>
-        </w:rPr>
-        <w:t>Solutions</w:t>
-      </w:r>
-      <w:r>
-        <w:t>.</w:t>
+        <w:t>Technicians</w:t>
+      </w:r>
+    </w:p>
+    <w:p>
+      <w:pPr>
+        <w:pStyle w:val="ListBullet2"/>
+      </w:pPr>
+      <w:r>
+        <w:t>Appraisal Expectations</w:t>
+      </w:r>
+    </w:p>
+    <w:p>
+      <w:pPr>
+        <w:pStyle w:val="ListBullet2"/>
+      </w:pPr>
+      <w:r>
+        <w:t>Monthly Reviews</w:t>
+      </w:r>
+    </w:p>
+    <w:p>
+      <w:pPr>
+        <w:pStyle w:val="ListBullet2"/>
+      </w:pPr>
+      <w:r>
+        <w:t>Manager Reviews</w:t>
+      </w:r>
+    </w:p>
+    <w:p>
+      <w:pPr>
+        <w:pStyle w:val="ListBullet2"/>
+      </w:pPr>
+      <w:r>
+        <w:t>Wellbeing Assessments</w:t>
+      </w:r>
+    </w:p>
+    <w:p>
+      <w:pPr>
+        <w:pStyle w:val="ListBullet2"/>
+      </w:pPr>
+      <w:r>
+        <w:t>1-to-1 Feedback</w:t>
+      </w:r>
+    </w:p>
+    <w:p>
+      <w:pPr>
+        <w:pStyle w:val="ListBullet2"/>
+      </w:pPr>
+      <w:r>
+        <w:t>1-to-1 Challenges</w:t>
       </w:r>
     </w:p>
     <w:p>
@@ -247,16 +365,41 @@
         <w:t xml:space="preserve">☐ 3.  </w:t>
       </w:r>
       <w:r>
-        <w:t xml:space="preserve">At the top, click </w:t>
+        <w:t xml:space="preserve">Save the files in a </w:t>
       </w:r>
       <w:r>
         <w:rPr>
           <w:b/>
         </w:rPr>
-        <w:t>Import solution</w:t>
-      </w:r>
-      <w:r>
-        <w:t>.</w:t>
+        <w:t>private</w:t>
+      </w:r>
+      <w:r>
+        <w:t xml:space="preserve"> folder. They contain personal information.</w:t>
+      </w:r>
+    </w:p>
+    <w:p>
+      <w:r>
+        <w:t xml:space="preserve">✅ </w:t>
+      </w:r>
+      <w:r>
+        <w:rPr>
+          <w:b/>
+        </w:rPr>
+        <w:t>Done when:</w:t>
+      </w:r>
+      <w:r>
+        <w:t xml:space="preserve"> you have 7 CSV files saved.</w:t>
+      </w:r>
+    </w:p>
+    <w:p>
+      <w:pPr>
+        <w:pStyle w:val="Heading1"/>
+      </w:pPr>
+      <w:r>
+        <w:rPr>
+          <w:color w:val="13516B"/>
+        </w:rPr>
+        <w:t>Part 2 – Switch two things off (2 minutes)</w:t>
       </w:r>
     </w:p>
     <w:p>
@@ -267,28 +410,54 @@
         <w:rPr>
           <w:b/>
         </w:rPr>
-        <w:t xml:space="preserve">☐ 4.  </w:t>
-      </w:r>
-      <w:r>
-        <w:t xml:space="preserve">Click </w:t>
+        <w:t xml:space="preserve">☐ 1.  </w:t>
+      </w:r>
+      <w:r>
+        <w:t xml:space="preserve">Go to </w:t>
       </w:r>
       <w:r>
         <w:rPr>
           <w:b/>
         </w:rPr>
-        <w:t>Browse</w:t>
-      </w:r>
-      <w:r>
-        <w:t xml:space="preserve">, find </w:t>
+        <w:t>make.powerautomate.com</w:t>
+      </w:r>
+      <w:r>
+        <w:t xml:space="preserve"> → </w:t>
       </w:r>
       <w:r>
         <w:rPr>
           <w:b/>
         </w:rPr>
-        <w:t>ESGOneToOne_1_3_0_0_unmanaged.zip</w:t>
-      </w:r>
-      <w:r>
-        <w:t xml:space="preserve"> and double-click it.</w:t>
+        <w:t>Solutions</w:t>
+      </w:r>
+      <w:r>
+        <w:t xml:space="preserve"> → </w:t>
+      </w:r>
+      <w:r>
+        <w:rPr>
+          <w:b/>
+        </w:rPr>
+        <w:t>ESG 1-to-1</w:t>
+      </w:r>
+      <w:r>
+        <w:t>.</w:t>
+      </w:r>
+    </w:p>
+    <w:p>
+      <w:pPr>
+        <w:pStyle w:val="ListBullet2"/>
+      </w:pPr>
+      <w:r>
+        <w:t xml:space="preserve">If you can't see Solutions, click </w:t>
+      </w:r>
+      <w:r>
+        <w:rPr>
+          <w:b/>
+        </w:rPr>
+        <w:t>More</w:t>
+      </w:r>
+      <w:r>
+        <w:t xml:space="preserve"> first.</w:t>
       </w:r>
     </w:p>
     <w:p>
@@ -299,19 +468,28 @@
         <w:rPr>
           <w:b/>
         </w:rPr>
-        <w:t xml:space="preserve">☐ 5.  </w:t>
-      </w:r>
-      <w:r>
-        <w:t xml:space="preserve">Click </w:t>
+        <w:t xml:space="preserve">☐ 2.  </w:t>
+      </w:r>
+      <w:r>
+        <w:t xml:space="preserve">Tick the circle next to </w:t>
       </w:r>
       <w:r>
         <w:rPr>
           <w:b/>
         </w:rPr>
-        <w:t>Next</w:t>
-      </w:r>
-      <w:r>
-        <w:t>.</w:t>
+        <w:t>ESG 1-to-1 | 7 Challenge</w:t>
+      </w:r>
+      <w:r>
+        <w:t xml:space="preserve">, then click </w:t>
+      </w:r>
+      <w:r>
+        <w:rPr>
+          <w:b/>
+        </w:rPr>
+        <w:t>Turn off</w:t>
+      </w:r>
+      <w:r>
+        <w:t xml:space="preserve"> at the top.</w:t>
       </w:r>
     </w:p>
     <w:p>
@@ -322,7 +500,174 @@
         <w:rPr>
           <w:b/>
         </w:rPr>
-        <w:t xml:space="preserve">☐ 6.  </w:t>
+        <w:t xml:space="preserve">☐ 3.  </w:t>
+      </w:r>
+      <w:r>
+        <w:t xml:space="preserve">Do the same for </w:t>
+      </w:r>
+      <w:r>
+        <w:rPr>
+          <w:b/>
+        </w:rPr>
+        <w:t>ESG 1-to-1 | 1 Daily scheduler</w:t>
+      </w:r>
+      <w:r>
+        <w:t>.</w:t>
+      </w:r>
+    </w:p>
+    <w:p>
+      <w:r>
+        <w:t xml:space="preserve">✅ </w:t>
+      </w:r>
+      <w:r>
+        <w:rPr>
+          <w:b/>
+        </w:rPr>
+        <w:t>Done when:</w:t>
+      </w:r>
+      <w:r>
+        <w:t xml:space="preserve"> 1 and 7 both say </w:t>
+      </w:r>
+      <w:r>
+        <w:rPr>
+          <w:b/>
+        </w:rPr>
+        <w:t>Off</w:t>
+      </w:r>
+      <w:r>
+        <w:t>.</w:t>
+      </w:r>
+    </w:p>
+    <w:p>
+      <w:pPr>
+        <w:pStyle w:val="Heading1"/>
+      </w:pPr>
+      <w:r>
+        <w:rPr>
+          <w:color w:val="13516B"/>
+        </w:rPr>
+        <w:t>Part 3 – Install the new version (10 minutes)</w:t>
+      </w:r>
+    </w:p>
+    <w:p>
+      <w:pPr>
+        <w:ind w:left="360" w:hanging="360"/>
+      </w:pPr>
+      <w:r>
+        <w:rPr>
+          <w:b/>
+        </w:rPr>
+        <w:t xml:space="preserve">☐ 1.  </w:t>
+      </w:r>
+      <w:r>
+        <w:t xml:space="preserve">Go back to the </w:t>
+      </w:r>
+      <w:r>
+        <w:rPr>
+          <w:b/>
+        </w:rPr>
+        <w:t>Solutions</w:t>
+      </w:r>
+      <w:r>
+        <w:t xml:space="preserve"> list (click </w:t>
+      </w:r>
+      <w:r>
+        <w:rPr>
+          <w:b/>
+        </w:rPr>
+        <w:t>Solutions</w:t>
+      </w:r>
+      <w:r>
+        <w:t xml:space="preserve"> on the left).</w:t>
+      </w:r>
+    </w:p>
+    <w:p>
+      <w:pPr>
+        <w:ind w:left="360" w:hanging="360"/>
+      </w:pPr>
+      <w:r>
+        <w:rPr>
+          <w:b/>
+        </w:rPr>
+        <w:t xml:space="preserve">☐ 2.  </w:t>
+      </w:r>
+      <w:r>
+        <w:t xml:space="preserve">At the top, click </w:t>
+      </w:r>
+      <w:r>
+        <w:rPr>
+          <w:b/>
+        </w:rPr>
+        <w:t>Import solution</w:t>
+      </w:r>
+      <w:r>
+        <w:t>.</w:t>
+      </w:r>
+    </w:p>
+    <w:p>
+      <w:pPr>
+        <w:ind w:left="360" w:hanging="360"/>
+      </w:pPr>
+      <w:r>
+        <w:rPr>
+          <w:b/>
+        </w:rPr>
+        <w:t xml:space="preserve">☐ 3.  </w:t>
+      </w:r>
+      <w:r>
+        <w:t xml:space="preserve">Click </w:t>
+      </w:r>
+      <w:r>
+        <w:rPr>
+          <w:b/>
+        </w:rPr>
+        <w:t>Browse</w:t>
+      </w:r>
+      <w:r>
+        <w:t xml:space="preserve">, find </w:t>
+      </w:r>
+      <w:r>
+        <w:rPr>
+          <w:b/>
+        </w:rPr>
+        <w:t>ESGOneToOne_1_4_0_0_unmanaged.zip</w:t>
+      </w:r>
+      <w:r>
+        <w:t xml:space="preserve"> and double-click it.</w:t>
+      </w:r>
+    </w:p>
+    <w:p>
+      <w:pPr>
+        <w:ind w:left="360" w:hanging="360"/>
+      </w:pPr>
+      <w:r>
+        <w:rPr>
+          <w:b/>
+        </w:rPr>
+        <w:t xml:space="preserve">☐ 4.  </w:t>
+      </w:r>
+      <w:r>
+        <w:t xml:space="preserve">Click </w:t>
+      </w:r>
+      <w:r>
+        <w:rPr>
+          <w:b/>
+        </w:rPr>
+        <w:t>Next</w:t>
+      </w:r>
+      <w:r>
+        <w:t>.</w:t>
+      </w:r>
+    </w:p>
+    <w:p>
+      <w:pPr>
+        <w:ind w:left="360" w:hanging="360"/>
+      </w:pPr>
+      <w:r>
+        <w:rPr>
+          <w:b/>
+        </w:rPr>
+        <w:t xml:space="preserve">☐ 5.  </w:t>
       </w:r>
       <w:r>
         <w:t xml:space="preserve">You'll see a screen that mentions </w:t>
@@ -385,7 +730,7 @@
         <w:rPr>
           <w:b/>
         </w:rPr>
-        <w:t xml:space="preserve">☐ 7.  </w:t>
+        <w:t xml:space="preserve">☐ 6.  </w:t>
       </w:r>
       <w:r>
         <w:t xml:space="preserve">Click </w:t>
@@ -426,7 +771,7 @@
         <w:rPr>
           <w:b/>
         </w:rPr>
-        <w:t xml:space="preserve">☐ 8.  </w:t>
+        <w:t xml:space="preserve">☐ 7.  </w:t>
       </w:r>
       <w:r>
         <w:rPr>
@@ -469,12 +814,21 @@
         <w:rPr>
           <w:color w:val="13516B"/>
         </w:rPr>
-        <w:t>Part 2 – Run "Setup" once (5 minutes, plus waiting for an email)</w:t>
+        <w:t>Part 4 – Run "Setup" once (5 minutes, plus waiting for an email)</w:t>
       </w:r>
     </w:p>
     <w:p>
       <w:r>
-        <w:t>This adds the new list the challenge feature needs. It never deletes anything.</w:t>
+        <w:t xml:space="preserve">This adds the new columns and the new </w:t>
+      </w:r>
+      <w:r>
+        <w:rPr>
+          <w:b/>
+        </w:rPr>
+        <w:t>1-to-1 Amendments</w:t>
+      </w:r>
+      <w:r>
+        <w:t xml:space="preserve"> list. It also closes off the old challenges list. It never deletes anything.</w:t>
       </w:r>
     </w:p>
     <w:p>
@@ -488,16 +842,7 @@
         <w:t xml:space="preserve">☐ 1.  </w:t>
       </w:r>
       <w:r>
-        <w:t xml:space="preserve">Still in </w:t>
-      </w:r>
-      <w:r>
-        <w:rPr>
-          <w:b/>
-        </w:rPr>
-        <w:t>Solutions</w:t>
-      </w:r>
-      <w:r>
-        <w:t xml:space="preserve">, click </w:t>
+        <w:t xml:space="preserve">Open </w:t>
       </w:r>
       <w:r>
         <w:rPr>
@@ -506,7 +851,16 @@
         <w:t>ESG 1-to-1</w:t>
       </w:r>
       <w:r>
-        <w:t xml:space="preserve"> to open it.</w:t>
+        <w:t xml:space="preserve">, then the one called </w:t>
+      </w:r>
+      <w:r>
+        <w:rPr>
+          <w:b/>
+        </w:rPr>
+        <w:t>ESG 1-to-1 | 0 Setup (run once)</w:t>
+      </w:r>
+      <w:r>
+        <w:t>.</w:t>
       </w:r>
     </w:p>
     <w:p>
@@ -520,13 +874,31 @@
         <w:t xml:space="preserve">☐ 2.  </w:t>
       </w:r>
       <w:r>
-        <w:t xml:space="preserve">In the list, click the one called </w:t>
+        <w:t xml:space="preserve">At the top, click </w:t>
       </w:r>
       <w:r>
         <w:rPr>
           <w:b/>
         </w:rPr>
-        <w:t>ESG 1-to-1 | 0 Setup (run once)</w:t>
+        <w:t>Run</w:t>
+      </w:r>
+      <w:r>
+        <w:t xml:space="preserve">, then </w:t>
+      </w:r>
+      <w:r>
+        <w:rPr>
+          <w:b/>
+        </w:rPr>
+        <w:t>Run flow</w:t>
+      </w:r>
+      <w:r>
+        <w:t xml:space="preserve">, then </w:t>
+      </w:r>
+      <w:r>
+        <w:rPr>
+          <w:b/>
+        </w:rPr>
+        <w:t>Done</w:t>
       </w:r>
       <w:r>
         <w:t>.</w:t>
@@ -543,16 +915,62 @@
         <w:t xml:space="preserve">☐ 3.  </w:t>
       </w:r>
       <w:r>
-        <w:t xml:space="preserve">At the top, click </w:t>
-      </w:r>
-      <w:r>
         <w:rPr>
           <w:b/>
         </w:rPr>
-        <w:t>Run</w:t>
+        <w:t>Wait for an email</w:t>
+      </w:r>
+      <w:r>
+        <w:t xml:space="preserve"> from it with a summary. It usually arrives within </w:t>
+      </w:r>
+      <w:r>
+        <w:rPr>
+          <w:b/>
+        </w:rPr>
+        <w:t>5–10 minutes</w:t>
       </w:r>
       <w:r>
         <w:t>.</w:t>
+      </w:r>
+    </w:p>
+    <w:p>
+      <w:r>
+        <w:t xml:space="preserve">✅ </w:t>
+      </w:r>
+      <w:r>
+        <w:rPr>
+          <w:b/>
+        </w:rPr>
+        <w:t>Done when:</w:t>
+      </w:r>
+      <w:r>
+        <w:t xml:space="preserve"> the email arrives saying </w:t>
+      </w:r>
+      <w:r>
+        <w:rPr>
+          <w:b/>
+        </w:rPr>
+        <w:t>setup: complete</w:t>
+      </w:r>
+      <w:r>
+        <w:t xml:space="preserve">. </w:t>
+      </w:r>
+      <w:r>
+        <w:rPr>
+          <w:b/>
+        </w:rPr>
+        <w:t>Don't move on until it has.</w:t>
+      </w:r>
+    </w:p>
+    <w:p>
+      <w:pPr>
+        <w:pStyle w:val="Heading1"/>
+      </w:pPr>
+      <w:r>
+        <w:rPr>
+          <w:color w:val="13516B"/>
+        </w:rPr>
+        <w:t>Part 5 – Switch the automatic steps on (5 minutes)</w:t>
       </w:r>
     </w:p>
     <w:p>
@@ -563,16 +981,16 @@
         <w:rPr>
           <w:b/>
         </w:rPr>
-        <w:t xml:space="preserve">☐ 4.  </w:t>
-      </w:r>
-      <w:r>
-        <w:t xml:space="preserve">A panel opens on the right. Click </w:t>
+        <w:t xml:space="preserve">☐ 1.  </w:t>
+      </w:r>
+      <w:r>
+        <w:t xml:space="preserve">Go back to </w:t>
       </w:r>
       <w:r>
         <w:rPr>
           <w:b/>
         </w:rPr>
-        <w:t>Run flow</w:t>
+        <w:t>Solutions → ESG 1-to-1</w:t>
       </w:r>
       <w:r>
         <w:t>.</w:t>
@@ -586,19 +1004,139 @@
         <w:rPr>
           <w:b/>
         </w:rPr>
-        <w:t xml:space="preserve">☐ 5.  </w:t>
-      </w:r>
-      <w:r>
-        <w:t xml:space="preserve">Click </w:t>
+        <w:t xml:space="preserve">☐ 2.  </w:t>
+      </w:r>
+      <w:r>
+        <w:t xml:space="preserve">Turn these on, in this order (tick the circle, click </w:t>
       </w:r>
       <w:r>
         <w:rPr>
           <w:b/>
         </w:rPr>
-        <w:t>Done</w:t>
-      </w:r>
-      <w:r>
-        <w:t>.</w:t>
+        <w:t>Turn on</w:t>
+      </w:r>
+      <w:r>
+        <w:t>):</w:t>
+      </w:r>
+    </w:p>
+    <w:p>
+      <w:pPr>
+        <w:ind w:left="720" w:hanging="360"/>
+      </w:pPr>
+      <w:r>
+        <w:rPr>
+          <w:b/>
+        </w:rPr>
+        <w:t xml:space="preserve">☐ 1.  </w:t>
+      </w:r>
+      <w:r>
+        <w:rPr>
+          <w:b/>
+        </w:rPr>
+        <w:t>2</w:t>
+      </w:r>
+      <w:r>
+        <w:t xml:space="preserve"> Review submitted</w:t>
+      </w:r>
+    </w:p>
+    <w:p>
+      <w:pPr>
+        <w:ind w:left="720" w:hanging="360"/>
+      </w:pPr>
+      <w:r>
+        <w:rPr>
+          <w:b/>
+        </w:rPr>
+        <w:t xml:space="preserve">☐ 2.  </w:t>
+      </w:r>
+      <w:r>
+        <w:rPr>
+          <w:b/>
+        </w:rPr>
+        <w:t>3</w:t>
+      </w:r>
+      <w:r>
+        <w:t xml:space="preserve"> Manager decision</w:t>
+      </w:r>
+    </w:p>
+    <w:p>
+      <w:pPr>
+        <w:ind w:left="720" w:hanging="360"/>
+      </w:pPr>
+      <w:r>
+        <w:rPr>
+          <w:b/>
+        </w:rPr>
+        <w:t xml:space="preserve">☐ 3.  </w:t>
+      </w:r>
+      <w:r>
+        <w:rPr>
+          <w:b/>
+        </w:rPr>
+        <w:t>4</w:t>
+      </w:r>
+      <w:r>
+        <w:t xml:space="preserve"> Team members</w:t>
+      </w:r>
+    </w:p>
+    <w:p>
+      <w:pPr>
+        <w:ind w:left="720" w:hanging="360"/>
+      </w:pPr>
+      <w:r>
+        <w:rPr>
+          <w:b/>
+        </w:rPr>
+        <w:t xml:space="preserve">☐ 4.  </w:t>
+      </w:r>
+      <w:r>
+        <w:rPr>
+          <w:b/>
+        </w:rPr>
+        <w:t>5</w:t>
+      </w:r>
+      <w:r>
+        <w:t xml:space="preserve"> Wellbeing</w:t>
+      </w:r>
+    </w:p>
+    <w:p>
+      <w:pPr>
+        <w:ind w:left="720" w:hanging="360"/>
+      </w:pPr>
+      <w:r>
+        <w:rPr>
+          <w:b/>
+        </w:rPr>
+        <w:t xml:space="preserve">☐ 5.  </w:t>
+      </w:r>
+      <w:r>
+        <w:rPr>
+          <w:b/>
+        </w:rPr>
+        <w:t>6</w:t>
+      </w:r>
+      <w:r>
+        <w:t xml:space="preserve"> Feedback</w:t>
+      </w:r>
+    </w:p>
+    <w:p>
+      <w:pPr>
+        <w:ind w:left="720" w:hanging="360"/>
+      </w:pPr>
+      <w:r>
+        <w:rPr>
+          <w:b/>
+        </w:rPr>
+        <w:t xml:space="preserve">☐ 6.  </w:t>
+      </w:r>
+      <w:r>
+        <w:rPr>
+          <w:b/>
+        </w:rPr>
+        <w:t>8 Amendment notice</w:t>
+      </w:r>
+      <w:r>
+        <w:t xml:space="preserve"> (this one is new)</w:t>
       </w:r>
     </w:p>
     <w:p>
@@ -609,25 +1147,25 @@
         <w:rPr>
           <w:b/>
         </w:rPr>
-        <w:t xml:space="preserve">☐ 6.  </w:t>
+        <w:t xml:space="preserve">☐ 3.  </w:t>
       </w:r>
       <w:r>
         <w:rPr>
           <w:b/>
         </w:rPr>
-        <w:t>Wait for an email</w:t>
-      </w:r>
-      <w:r>
-        <w:t xml:space="preserve"> to you from it with a summary. It usually arrives within </w:t>
+        <w:t>Leave 1 and 7 off for now.</w:t>
+      </w:r>
+      <w:r>
+        <w:t xml:space="preserve"> Leave </w:t>
       </w:r>
       <w:r>
         <w:rPr>
           <w:b/>
         </w:rPr>
-        <w:t>5–10 minutes</w:t>
-      </w:r>
-      <w:r>
-        <w:t>.</w:t>
+        <w:t>0 Setup</w:t>
+      </w:r>
+      <w:r>
+        <w:t xml:space="preserve"> as it is.</w:t>
       </w:r>
     </w:p>
     <w:p>
@@ -641,13 +1179,25 @@
         <w:t>Done when:</w:t>
       </w:r>
       <w:r>
-        <w:t xml:space="preserve"> the Setup summary email has arrived. </w:t>
+        <w:t xml:space="preserve"> 2, 3, 4, 5, 6 and 8 say </w:t>
       </w:r>
       <w:r>
         <w:rPr>
           <w:b/>
         </w:rPr>
-        <w:t>Don't move on to Part 3 until it has.</w:t>
+        <w:t>On</w:t>
+      </w:r>
+      <w:r>
+        <w:t xml:space="preserve">, and 1 and 7 say </w:t>
+      </w:r>
+      <w:r>
+        <w:rPr>
+          <w:b/>
+        </w:rPr>
+        <w:t>Off</w:t>
+      </w:r>
+      <w:r>
+        <w:t>.</w:t>
       </w:r>
     </w:p>
     <w:p>
@@ -658,7 +1208,7 @@
         <w:rPr>
           <w:color w:val="13516B"/>
         </w:rPr>
-        <w:t>Part 3 – Switch on the new automatic step (5 minutes)</w:t>
+        <w:t>Part 6 – Put the new page files on the site (10 minutes)</w:t>
       </w:r>
     </w:p>
     <w:p>
@@ -672,13 +1222,13 @@
         <w:t xml:space="preserve">☐ 1.  </w:t>
       </w:r>
       <w:r>
-        <w:t xml:space="preserve">Go back to </w:t>
+        <w:t xml:space="preserve">On the 1-to-1 site: </w:t>
       </w:r>
       <w:r>
         <w:rPr>
           <w:b/>
         </w:rPr>
-        <w:t>Solutions → ESG 1-to-1</w:t>
+        <w:t>gear icon ⚙ → Site contents → Welcome Web Part - Custom Layouts</w:t>
       </w:r>
       <w:r>
         <w:t>.</w:t>
@@ -695,22 +1245,13 @@
         <w:t xml:space="preserve">☐ 2.  </w:t>
       </w:r>
       <w:r>
-        <w:t xml:space="preserve">Find </w:t>
+        <w:t xml:space="preserve">Click </w:t>
       </w:r>
       <w:r>
         <w:rPr>
           <w:b/>
         </w:rPr>
-        <w:t>ESG 1-to-1 | 7 Challenge</w:t>
-      </w:r>
-      <w:r>
-        <w:t xml:space="preserve">. It will say </w:t>
-      </w:r>
-      <w:r>
-        <w:rPr>
-          <w:b/>
-        </w:rPr>
-        <w:t>Off</w:t>
+        <w:t>Upload → Files</w:t>
       </w:r>
       <w:r>
         <w:t>.</w:t>
@@ -727,13 +1268,40 @@
         <w:t xml:space="preserve">☐ 3.  </w:t>
       </w:r>
       <w:r>
-        <w:t xml:space="preserve">Tick the circle next to its name, then at the top click </w:t>
+        <w:t xml:space="preserve">Select </w:t>
       </w:r>
       <w:r>
         <w:rPr>
           <w:b/>
         </w:rPr>
-        <w:t>Turn on</w:t>
+        <w:t>one-to-one.html</w:t>
+      </w:r>
+      <w:r>
+        <w:t xml:space="preserve"> and </w:t>
+      </w:r>
+      <w:r>
+        <w:rPr>
+          <w:b/>
+        </w:rPr>
+        <w:t>one-to-one.js</w:t>
+      </w:r>
+      <w:r>
+        <w:t xml:space="preserve"> together (hold </w:t>
+      </w:r>
+      <w:r>
+        <w:rPr>
+          <w:b/>
+        </w:rPr>
+        <w:t>Ctrl</w:t>
+      </w:r>
+      <w:r>
+        <w:t xml:space="preserve"> and click both), then click </w:t>
+      </w:r>
+      <w:r>
+        <w:rPr>
+          <w:b/>
+        </w:rPr>
+        <w:t>Open</w:t>
       </w:r>
       <w:r>
         <w:t>.</w:t>
@@ -750,16 +1318,257 @@
         <w:t xml:space="preserve">☐ 4.  </w:t>
       </w:r>
       <w:r>
-        <w:t xml:space="preserve">Now check the others. Each of these should say </w:t>
+        <w:t xml:space="preserve">A message says the files </w:t>
       </w:r>
       <w:r>
         <w:rPr>
           <w:b/>
         </w:rPr>
-        <w:t>On</w:t>
-      </w:r>
-      <w:r>
-        <w:t>:</w:t>
+        <w:t>already exist</w:t>
+      </w:r>
+      <w:r>
+        <w:t xml:space="preserve">. Choose </w:t>
+      </w:r>
+      <w:r>
+        <w:rPr>
+          <w:b/>
+        </w:rPr>
+        <w:t>Replace</w:t>
+      </w:r>
+      <w:r>
+        <w:t xml:space="preserve"> for both.</w:t>
+      </w:r>
+    </w:p>
+    <w:p>
+      <w:pPr>
+        <w:ind w:left="360" w:hanging="360"/>
+      </w:pPr>
+      <w:r>
+        <w:rPr>
+          <w:b/>
+        </w:rPr>
+        <w:t xml:space="preserve">☐ 5.  </w:t>
+      </w:r>
+      <w:r>
+        <w:t xml:space="preserve">Open the </w:t>
+      </w:r>
+      <w:r>
+        <w:rPr>
+          <w:b/>
+        </w:rPr>
+        <w:t>1-to-1 page</w:t>
+      </w:r>
+      <w:r>
+        <w:t>, the one everyone uses.</w:t>
+      </w:r>
+    </w:p>
+    <w:p>
+      <w:pPr>
+        <w:ind w:left="360" w:hanging="360"/>
+      </w:pPr>
+      <w:r>
+        <w:rPr>
+          <w:b/>
+        </w:rPr>
+        <w:t xml:space="preserve">☐ 6.  </w:t>
+      </w:r>
+      <w:r>
+        <w:t xml:space="preserve">Click </w:t>
+      </w:r>
+      <w:r>
+        <w:rPr>
+          <w:b/>
+        </w:rPr>
+        <w:t>Edit</w:t>
+      </w:r>
+      <w:r>
+        <w:t xml:space="preserve"> (top right).</w:t>
+      </w:r>
+    </w:p>
+    <w:p>
+      <w:pPr>
+        <w:ind w:left="360" w:hanging="360"/>
+      </w:pPr>
+      <w:r>
+        <w:rPr>
+          <w:b/>
+        </w:rPr>
+        <w:t xml:space="preserve">☐ 7.  </w:t>
+      </w:r>
+      <w:r>
+        <w:t xml:space="preserve">Click once on the big 1-to-1 area, then click the small </w:t>
+      </w:r>
+      <w:r>
+        <w:rPr>
+          <w:b/>
+        </w:rPr>
+        <w:t>pencil ✏</w:t>
+      </w:r>
+      <w:r>
+        <w:t xml:space="preserve"> on its left.</w:t>
+      </w:r>
+    </w:p>
+    <w:p>
+      <w:pPr>
+        <w:ind w:left="360" w:hanging="360"/>
+      </w:pPr>
+      <w:r>
+        <w:rPr>
+          <w:b/>
+        </w:rPr>
+        <w:t xml:space="preserve">☐ 8.  </w:t>
+      </w:r>
+      <w:r>
+        <w:t xml:space="preserve">Click </w:t>
+      </w:r>
+      <w:r>
+        <w:rPr>
+          <w:b/>
+        </w:rPr>
+        <w:t>Reset layout cache</w:t>
+      </w:r>
+      <w:r>
+        <w:t>.</w:t>
+      </w:r>
+    </w:p>
+    <w:p>
+      <w:pPr>
+        <w:ind w:left="360" w:hanging="360"/>
+      </w:pPr>
+      <w:r>
+        <w:rPr>
+          <w:b/>
+        </w:rPr>
+        <w:t xml:space="preserve">☐ 9.  </w:t>
+      </w:r>
+      <w:r>
+        <w:t xml:space="preserve">Close the panel, then click </w:t>
+      </w:r>
+      <w:r>
+        <w:rPr>
+          <w:b/>
+        </w:rPr>
+        <w:t>Republish</w:t>
+      </w:r>
+      <w:r>
+        <w:t>.</w:t>
+      </w:r>
+    </w:p>
+    <w:p>
+      <w:pPr>
+        <w:ind w:left="360" w:hanging="360"/>
+      </w:pPr>
+      <w:r>
+        <w:rPr>
+          <w:b/>
+        </w:rPr>
+        <w:t xml:space="preserve">☐ 10.  </w:t>
+      </w:r>
+      <w:r>
+        <w:t xml:space="preserve">Press </w:t>
+      </w:r>
+      <w:r>
+        <w:rPr>
+          <w:b/>
+        </w:rPr>
+        <w:t>Ctrl + F5</w:t>
+      </w:r>
+      <w:r>
+        <w:t xml:space="preserve">. The top right of the dark blue bar should say </w:t>
+      </w:r>
+      <w:r>
+        <w:rPr>
+          <w:b/>
+        </w:rPr>
+        <w:t>v5.0.0</w:t>
+      </w:r>
+      <w:r>
+        <w:t>.</w:t>
+      </w:r>
+    </w:p>
+    <w:p>
+      <w:r>
+        <w:t xml:space="preserve">✅ </w:t>
+      </w:r>
+      <w:r>
+        <w:rPr>
+          <w:b/>
+        </w:rPr>
+        <w:t>Done when:</w:t>
+      </w:r>
+      <w:r>
+        <w:t xml:space="preserve"> you see </w:t>
+      </w:r>
+      <w:r>
+        <w:rPr>
+          <w:b/>
+        </w:rPr>
+        <w:t>v5.0.0</w:t>
+      </w:r>
+      <w:r>
+        <w:t>.</w:t>
+      </w:r>
+    </w:p>
+    <w:p>
+      <w:pPr>
+        <w:pStyle w:val="Heading1"/>
+      </w:pPr>
+      <w:r>
+        <w:rPr>
+          <w:color w:val="13516B"/>
+        </w:rPr>
+        <w:t>Part 7 – Enter everyone's dates (10 minutes)</w:t>
+      </w:r>
+    </w:p>
+    <w:p>
+      <w:r>
+        <w:t>The page never guesses dates. You enter them once, and after that they only change when you change them.</w:t>
+      </w:r>
+    </w:p>
+    <w:p>
+      <w:pPr>
+        <w:ind w:left="360" w:hanging="360"/>
+      </w:pPr>
+      <w:r>
+        <w:rPr>
+          <w:b/>
+        </w:rPr>
+        <w:t xml:space="preserve">☐ 1.  </w:t>
+      </w:r>
+      <w:r>
+        <w:t xml:space="preserve">On the 1-to-1 page, click </w:t>
+      </w:r>
+      <w:r>
+        <w:rPr>
+          <w:b/>
+        </w:rPr>
+        <w:t>⚙ Settings</w:t>
+      </w:r>
+      <w:r>
+        <w:t xml:space="preserve">, then the </w:t>
+      </w:r>
+      <w:r>
+        <w:rPr>
+          <w:b/>
+        </w:rPr>
+        <w:t>Team</w:t>
+      </w:r>
+      <w:r>
+        <w:t xml:space="preserve"> tab.</w:t>
+      </w:r>
+    </w:p>
+    <w:p>
+      <w:pPr>
+        <w:ind w:left="360" w:hanging="360"/>
+      </w:pPr>
+      <w:r>
+        <w:rPr>
+          <w:b/>
+        </w:rPr>
+        <w:t xml:space="preserve">☐ 2.  </w:t>
+      </w:r>
+      <w:r>
+        <w:t>For each person, fill in:</w:t>
       </w:r>
     </w:p>
     <w:p>
@@ -767,7 +1576,13 @@
         <w:pStyle w:val="ListBullet2"/>
       </w:pPr>
       <w:r>
-        <w:t>1 Daily scheduler</w:t>
+        <w:rPr>
+          <w:b/>
+        </w:rPr>
+        <w:t>Appraisal period start.</w:t>
+      </w:r>
+      <w:r>
+        <w:t xml:space="preserve"> The date their last appraisal was actually done.</w:t>
       </w:r>
     </w:p>
     <w:p>
@@ -775,7 +1590,13 @@
         <w:pStyle w:val="ListBullet2"/>
       </w:pPr>
       <w:r>
-        <w:t>2 Review submitted</w:t>
+        <w:rPr>
+          <w:b/>
+        </w:rPr>
+        <w:t>Next appraisal.</w:t>
+      </w:r>
+      <w:r>
+        <w:t xml:space="preserve"> Check it's right.</w:t>
       </w:r>
     </w:p>
     <w:p>
@@ -783,7 +1604,13 @@
         <w:pStyle w:val="ListBullet2"/>
       </w:pPr>
       <w:r>
-        <w:t>3 Manager decision</w:t>
+        <w:rPr>
+          <w:b/>
+        </w:rPr>
+        <w:t>Next wellbeing.</w:t>
+      </w:r>
+      <w:r>
+        <w:t xml:space="preserve"> When their next wellbeing assessment is due.</w:t>
       </w:r>
     </w:p>
     <w:p>
@@ -791,7 +1618,257 @@
         <w:pStyle w:val="ListBullet2"/>
       </w:pPr>
       <w:r>
-        <w:t>4 Team members</w:t>
+        <w:t xml:space="preserve">You can type a date like </w:t>
+      </w:r>
+      <w:r>
+        <w:rPr>
+          <w:b/>
+        </w:rPr>
+        <w:t>15/07/2027</w:t>
+      </w:r>
+      <w:r>
+        <w:t xml:space="preserve">, or click </w:t>
+      </w:r>
+      <w:r>
+        <w:rPr>
+          <w:b/>
+        </w:rPr>
+        <w:t>📅</w:t>
+      </w:r>
+      <w:r>
+        <w:t xml:space="preserve"> to pick it.</w:t>
+      </w:r>
+    </w:p>
+    <w:p>
+      <w:pPr>
+        <w:ind w:left="360" w:hanging="360"/>
+      </w:pPr>
+      <w:r>
+        <w:rPr>
+          <w:b/>
+        </w:rPr>
+        <w:t xml:space="preserve">☐ 3.  </w:t>
+      </w:r>
+      <w:r>
+        <w:t xml:space="preserve">Click </w:t>
+      </w:r>
+      <w:r>
+        <w:rPr>
+          <w:b/>
+        </w:rPr>
+        <w:t>Save settings</w:t>
+      </w:r>
+      <w:r>
+        <w:t>.</w:t>
+      </w:r>
+    </w:p>
+    <w:p>
+      <w:r>
+        <w:t xml:space="preserve">✅ </w:t>
+      </w:r>
+      <w:r>
+        <w:rPr>
+          <w:b/>
+        </w:rPr>
+        <w:t>Done when:</w:t>
+      </w:r>
+      <w:r>
+        <w:t xml:space="preserve"> everyone has all three dates, and </w:t>
+      </w:r>
+      <w:r>
+        <w:rPr>
+          <w:b/>
+        </w:rPr>
+        <w:t>Needs your attention</w:t>
+      </w:r>
+      <w:r>
+        <w:t xml:space="preserve"> no longer asks for any.</w:t>
+      </w:r>
+    </w:p>
+    <w:p>
+      <w:pPr>
+        <w:pStyle w:val="Heading1"/>
+      </w:pPr>
+      <w:r>
+        <w:rPr>
+          <w:color w:val="13516B"/>
+        </w:rPr>
+        <w:t>Part 8 – Switch the daily step back on (1 minute)</w:t>
+      </w:r>
+    </w:p>
+    <w:p>
+      <w:pPr>
+        <w:ind w:left="360" w:hanging="360"/>
+      </w:pPr>
+      <w:r>
+        <w:rPr>
+          <w:b/>
+        </w:rPr>
+        <w:t xml:space="preserve">☐ 1.  </w:t>
+      </w:r>
+      <w:r>
+        <w:t xml:space="preserve">In </w:t>
+      </w:r>
+      <w:r>
+        <w:rPr>
+          <w:b/>
+        </w:rPr>
+        <w:t>Solutions → ESG 1-to-1</w:t>
+      </w:r>
+      <w:r>
+        <w:t xml:space="preserve">, turn on </w:t>
+      </w:r>
+      <w:r>
+        <w:rPr>
+          <w:b/>
+        </w:rPr>
+        <w:t>1 Daily scheduler</w:t>
+      </w:r>
+      <w:r>
+        <w:t>.</w:t>
+      </w:r>
+    </w:p>
+    <w:p>
+      <w:r>
+        <w:t xml:space="preserve">✅ </w:t>
+      </w:r>
+      <w:r>
+        <w:rPr>
+          <w:b/>
+        </w:rPr>
+        <w:t>All done.</w:t>
+      </w:r>
+    </w:p>
+    <w:p>
+      <w:pPr>
+        <w:pStyle w:val="Heading1"/>
+      </w:pPr>
+      <w:r>
+        <w:rPr>
+          <w:color w:val="13516B"/>
+        </w:rPr>
+        <w:t>Later, with separate approval</w:t>
+      </w:r>
+    </w:p>
+    <w:p>
+      <w:pPr>
+        <w:pStyle w:val="ListBullet"/>
+      </w:pPr>
+      <w:r>
+        <w:rPr>
+          <w:b/>
+        </w:rPr>
+        <w:t>Clearing test data.</w:t>
+      </w:r>
+      <w:r>
+        <w:t xml:space="preserve"> If you want to clear the test 1-to-1s before go-live, follow </w:t>
+      </w:r>
+      <w:r>
+        <w:rPr>
+          <w:b/>
+        </w:rPr>
+        <w:t>RESET_PROCEDURE.md</w:t>
+      </w:r>
+      <w:r>
+        <w:t>. It has its own steps and safety checks.</w:t>
+      </w:r>
+    </w:p>
+    <w:p>
+      <w:pPr>
+        <w:pStyle w:val="ListBullet"/>
+      </w:pPr>
+      <w:r>
+        <w:rPr>
+          <w:b/>
+        </w:rPr>
+        <w:t>Removing the old challenge step.</w:t>
+      </w:r>
+      <w:r>
+        <w:t xml:space="preserve"> When you're happy everything works, delete </w:t>
+      </w:r>
+      <w:r>
+        <w:rPr>
+          <w:b/>
+        </w:rPr>
+        <w:t>ESG 1-to-1 | 7 Challenge</w:t>
+      </w:r>
+      <w:r>
+        <w:t xml:space="preserve">: tick it, then </w:t>
+      </w:r>
+      <w:r>
+        <w:rPr>
+          <w:b/>
+        </w:rPr>
+        <w:t>Delete</w:t>
+      </w:r>
+      <w:r>
+        <w:t>. Its old records stay in the list.</w:t>
+      </w:r>
+    </w:p>
+    <w:p>
+      <w:pPr>
+        <w:pStyle w:val="Heading1"/>
+      </w:pPr>
+      <w:r>
+        <w:rPr>
+          <w:color w:val="13516B"/>
+        </w:rPr>
+        <w:t>How the new bits work, day to day</w:t>
+      </w:r>
+    </w:p>
+    <w:p>
+      <w:pPr>
+        <w:pStyle w:val="ListBullet"/>
+      </w:pPr>
+      <w:r>
+        <w:rPr>
+          <w:b/>
+        </w:rPr>
+        <w:t>An appraisal has happened.</w:t>
+      </w:r>
+      <w:r>
+        <w:t xml:space="preserve"> Go to </w:t>
+      </w:r>
+      <w:r>
+        <w:rPr>
+          <w:b/>
+        </w:rPr>
+        <w:t>⚙ Settings → Team → Mark appraisal completed…</w:t>
+      </w:r>
+      <w:r>
+        <w:t xml:space="preserve"> and enter the date it actually happened and the next due date. The person's new period starts with fresh ratings. The old period stays in their history and reports.</w:t>
+      </w:r>
+    </w:p>
+    <w:p>
+      <w:pPr>
+        <w:pStyle w:val="ListBullet"/>
+      </w:pPr>
+      <w:r>
+        <w:rPr>
+          <w:b/>
+        </w:rPr>
+        <w:t>Changing a 1-to-1 after it's done.</w:t>
+      </w:r>
+      <w:r>
+        <w:t xml:space="preserve"> Open it and click </w:t>
+      </w:r>
+      <w:r>
+        <w:rPr>
+          <w:b/>
+        </w:rPr>
+        <w:t>Amend…</w:t>
+      </w:r>
+      <w:r>
+        <w:t xml:space="preserve">. Change what's needed, then click </w:t>
+      </w:r>
+      <w:r>
+        <w:rPr>
+          <w:b/>
+        </w:rPr>
+        <w:t>Save amendment…</w:t>
+      </w:r>
+      <w:r>
+        <w:t xml:space="preserve"> and give a reason.</w:t>
       </w:r>
     </w:p>
     <w:p>
@@ -799,7 +1876,7 @@
         <w:pStyle w:val="ListBullet2"/>
       </w:pPr>
       <w:r>
-        <w:t>5 Wellbeing</w:t>
+        <w:t>The person is emailed that it was amended. The email doesn't say what changed or why.</w:t>
       </w:r>
     </w:p>
     <w:p>
@@ -807,96 +1884,21 @@
         <w:pStyle w:val="ListBullet2"/>
       </w:pPr>
       <w:r>
-        <w:t>6 Feedback</w:t>
+        <w:t>Only you can see the before and after.</w:t>
       </w:r>
     </w:p>
     <w:p>
       <w:pPr>
-        <w:pStyle w:val="ListBullet2"/>
-      </w:pPr>
-      <w:r>
-        <w:t>7 Challenge</w:t>
-      </w:r>
-    </w:p>
-    <w:p>
-      <w:pPr>
-        <w:ind w:left="360" w:hanging="360"/>
+        <w:pStyle w:val="ListBullet"/>
       </w:pPr>
       <w:r>
         <w:rPr>
           <w:b/>
         </w:rPr>
-        <w:t xml:space="preserve">☐ 5.  </w:t>
-      </w:r>
-      <w:r>
-        <w:t xml:space="preserve">If any say </w:t>
-      </w:r>
-      <w:r>
-        <w:rPr>
-          <w:b/>
-        </w:rPr>
-        <w:t>Off</w:t>
-      </w:r>
-      <w:r>
-        <w:t xml:space="preserve">, turn them on the same way, in the order </w:t>
-      </w:r>
-      <w:r>
-        <w:rPr>
-          <w:b/>
-        </w:rPr>
-        <w:t>2, 3, 4, 5, 6, 7</w:t>
-      </w:r>
-      <w:r>
-        <w:t xml:space="preserve">, and </w:t>
-      </w:r>
-      <w:r>
-        <w:rPr>
-          <w:b/>
-        </w:rPr>
-        <w:t>1 last</w:t>
-      </w:r>
-      <w:r>
-        <w:t>.</w:t>
-      </w:r>
-    </w:p>
-    <w:p>
-      <w:pPr>
-        <w:pStyle w:val="ListBullet2"/>
-      </w:pPr>
-      <w:r>
-        <w:t xml:space="preserve">Leave </w:t>
-      </w:r>
-      <w:r>
-        <w:rPr>
-          <w:b/>
-        </w:rPr>
-        <w:t>0 Setup</w:t>
-      </w:r>
-      <w:r>
-        <w:t xml:space="preserve"> as it is. It only runs when you run it.</w:t>
-      </w:r>
-    </w:p>
-    <w:p>
-      <w:r>
-        <w:t xml:space="preserve">✅ </w:t>
-      </w:r>
-      <w:r>
-        <w:rPr>
-          <w:b/>
-        </w:rPr>
-        <w:t>Done when:</w:t>
-      </w:r>
-      <w:r>
-        <w:t xml:space="preserve"> flows 1 to 7 all say </w:t>
-      </w:r>
-      <w:r>
-        <w:rPr>
-          <w:b/>
-        </w:rPr>
-        <w:t>On</w:t>
-      </w:r>
-      <w:r>
-        <w:t>.</w:t>
+        <w:t>Completing a wellbeing assessment.</w:t>
+      </w:r>
+      <w:r>
+        <w:t xml:space="preserve"> You'll be asked to confirm, or set, the next wellbeing date.</w:t>
       </w:r>
     </w:p>
     <w:p>
@@ -907,583 +1909,6 @@
         <w:rPr>
           <w:color w:val="13516B"/>
         </w:rPr>
-        <w:t>Part 4 – Put the new page files on the site (10 minutes)</w:t>
-      </w:r>
-    </w:p>
-    <w:p>
-      <w:pPr>
-        <w:ind w:left="360" w:hanging="360"/>
-      </w:pPr>
-      <w:r>
-        <w:rPr>
-          <w:b/>
-        </w:rPr>
-        <w:t xml:space="preserve">☐ 1.  </w:t>
-      </w:r>
-      <w:r>
-        <w:t xml:space="preserve">Go to your </w:t>
-      </w:r>
-      <w:r>
-        <w:rPr>
-          <w:b/>
-        </w:rPr>
-        <w:t>1-to-1 SharePoint site</w:t>
-      </w:r>
-      <w:r>
-        <w:t xml:space="preserve"> (the one with the 1-to-1 page).</w:t>
-      </w:r>
-    </w:p>
-    <w:p>
-      <w:pPr>
-        <w:ind w:left="360" w:hanging="360"/>
-      </w:pPr>
-      <w:r>
-        <w:rPr>
-          <w:b/>
-        </w:rPr>
-        <w:t xml:space="preserve">☐ 2.  </w:t>
-      </w:r>
-      <w:r>
-        <w:t xml:space="preserve">Click the </w:t>
-      </w:r>
-      <w:r>
-        <w:rPr>
-          <w:b/>
-        </w:rPr>
-        <w:t>gear icon ⚙</w:t>
-      </w:r>
-      <w:r>
-        <w:t xml:space="preserve"> (top right), then </w:t>
-      </w:r>
-      <w:r>
-        <w:rPr>
-          <w:b/>
-        </w:rPr>
-        <w:t>Site contents</w:t>
-      </w:r>
-      <w:r>
-        <w:t>.</w:t>
-      </w:r>
-    </w:p>
-    <w:p>
-      <w:pPr>
-        <w:ind w:left="360" w:hanging="360"/>
-      </w:pPr>
-      <w:r>
-        <w:rPr>
-          <w:b/>
-        </w:rPr>
-        <w:t xml:space="preserve">☐ 3.  </w:t>
-      </w:r>
-      <w:r>
-        <w:t xml:space="preserve">Click the library called </w:t>
-      </w:r>
-      <w:r>
-        <w:rPr>
-          <w:b/>
-        </w:rPr>
-        <w:t>Welcome Web Part - Custom Layouts</w:t>
-      </w:r>
-      <w:r>
-        <w:t>.</w:t>
-      </w:r>
-    </w:p>
-    <w:p>
-      <w:pPr>
-        <w:ind w:left="360" w:hanging="360"/>
-      </w:pPr>
-      <w:r>
-        <w:rPr>
-          <w:b/>
-        </w:rPr>
-        <w:t xml:space="preserve">☐ 4.  </w:t>
-      </w:r>
-      <w:r>
-        <w:t xml:space="preserve">Click </w:t>
-      </w:r>
-      <w:r>
-        <w:rPr>
-          <w:b/>
-        </w:rPr>
-        <w:t>Upload</w:t>
-      </w:r>
-      <w:r>
-        <w:t xml:space="preserve">, then </w:t>
-      </w:r>
-      <w:r>
-        <w:rPr>
-          <w:b/>
-        </w:rPr>
-        <w:t>Files</w:t>
-      </w:r>
-      <w:r>
-        <w:t>.</w:t>
-      </w:r>
-    </w:p>
-    <w:p>
-      <w:pPr>
-        <w:ind w:left="360" w:hanging="360"/>
-      </w:pPr>
-      <w:r>
-        <w:rPr>
-          <w:b/>
-        </w:rPr>
-        <w:t xml:space="preserve">☐ 5.  </w:t>
-      </w:r>
-      <w:r>
-        <w:t xml:space="preserve">Select </w:t>
-      </w:r>
-      <w:r>
-        <w:rPr>
-          <w:b/>
-        </w:rPr>
-        <w:t>one-to-one.html</w:t>
-      </w:r>
-      <w:r>
-        <w:t xml:space="preserve"> and </w:t>
-      </w:r>
-      <w:r>
-        <w:rPr>
-          <w:b/>
-        </w:rPr>
-        <w:t>one-to-one.js</w:t>
-      </w:r>
-      <w:r>
-        <w:t xml:space="preserve"> together.</w:t>
-      </w:r>
-    </w:p>
-    <w:p>
-      <w:pPr>
-        <w:pStyle w:val="ListBullet2"/>
-      </w:pPr>
-      <w:r>
-        <w:t xml:space="preserve">Hold </w:t>
-      </w:r>
-      <w:r>
-        <w:rPr>
-          <w:b/>
-        </w:rPr>
-        <w:t>Ctrl</w:t>
-      </w:r>
-      <w:r>
-        <w:t xml:space="preserve"> and click both, then click </w:t>
-      </w:r>
-      <w:r>
-        <w:rPr>
-          <w:b/>
-        </w:rPr>
-        <w:t>Open</w:t>
-      </w:r>
-      <w:r>
-        <w:t>.</w:t>
-      </w:r>
-    </w:p>
-    <w:p>
-      <w:pPr>
-        <w:ind w:left="360" w:hanging="360"/>
-      </w:pPr>
-      <w:r>
-        <w:rPr>
-          <w:b/>
-        </w:rPr>
-        <w:t xml:space="preserve">☐ 6.  </w:t>
-      </w:r>
-      <w:r>
-        <w:t xml:space="preserve">A message says the files </w:t>
-      </w:r>
-      <w:r>
-        <w:rPr>
-          <w:b/>
-        </w:rPr>
-        <w:t>already exist</w:t>
-      </w:r>
-      <w:r>
-        <w:t xml:space="preserve">. Choose </w:t>
-      </w:r>
-      <w:r>
-        <w:rPr>
-          <w:b/>
-        </w:rPr>
-        <w:t>Replace</w:t>
-      </w:r>
-      <w:r>
-        <w:t xml:space="preserve"> for both.</w:t>
-      </w:r>
-    </w:p>
-    <w:p>
-      <w:pPr>
-        <w:ind w:left="360" w:hanging="360"/>
-      </w:pPr>
-      <w:r>
-        <w:rPr>
-          <w:b/>
-        </w:rPr>
-        <w:t xml:space="preserve">☐ 7.  </w:t>
-      </w:r>
-      <w:r>
-        <w:t xml:space="preserve">Now open the </w:t>
-      </w:r>
-      <w:r>
-        <w:rPr>
-          <w:b/>
-        </w:rPr>
-        <w:t>1-to-1 page</w:t>
-      </w:r>
-      <w:r>
-        <w:t xml:space="preserve"> itself, the page everyone uses.</w:t>
-      </w:r>
-    </w:p>
-    <w:p>
-      <w:pPr>
-        <w:ind w:left="360" w:hanging="360"/>
-      </w:pPr>
-      <w:r>
-        <w:rPr>
-          <w:b/>
-        </w:rPr>
-        <w:t xml:space="preserve">☐ 8.  </w:t>
-      </w:r>
-      <w:r>
-        <w:t xml:space="preserve">Click </w:t>
-      </w:r>
-      <w:r>
-        <w:rPr>
-          <w:b/>
-        </w:rPr>
-        <w:t>Edit</w:t>
-      </w:r>
-      <w:r>
-        <w:t xml:space="preserve"> (top right).</w:t>
-      </w:r>
-    </w:p>
-    <w:p>
-      <w:pPr>
-        <w:ind w:left="360" w:hanging="360"/>
-      </w:pPr>
-      <w:r>
-        <w:rPr>
-          <w:b/>
-        </w:rPr>
-        <w:t xml:space="preserve">☐ 9.  </w:t>
-      </w:r>
-      <w:r>
-        <w:t xml:space="preserve">Click once on the big 1-to-1 area. A small </w:t>
-      </w:r>
-      <w:r>
-        <w:rPr>
-          <w:b/>
-        </w:rPr>
-        <w:t>pencil icon ✏</w:t>
-      </w:r>
-      <w:r>
-        <w:t xml:space="preserve"> appears on its left. Click it.</w:t>
-      </w:r>
-    </w:p>
-    <w:p>
-      <w:pPr>
-        <w:ind w:left="360" w:hanging="360"/>
-      </w:pPr>
-      <w:r>
-        <w:rPr>
-          <w:b/>
-        </w:rPr>
-        <w:t xml:space="preserve">☐ 10.  </w:t>
-      </w:r>
-      <w:r>
-        <w:t xml:space="preserve">In the panel that opens, find and click </w:t>
-      </w:r>
-      <w:r>
-        <w:rPr>
-          <w:b/>
-        </w:rPr>
-        <w:t>Reset layout cache</w:t>
-      </w:r>
-      <w:r>
-        <w:t>.</w:t>
-      </w:r>
-    </w:p>
-    <w:p>
-      <w:pPr>
-        <w:ind w:left="360" w:hanging="360"/>
-      </w:pPr>
-      <w:r>
-        <w:rPr>
-          <w:b/>
-        </w:rPr>
-        <w:t xml:space="preserve">☐ 11.  </w:t>
-      </w:r>
-      <w:r>
-        <w:t xml:space="preserve">Close the panel, then click </w:t>
-      </w:r>
-      <w:r>
-        <w:rPr>
-          <w:b/>
-        </w:rPr>
-        <w:t>Republish</w:t>
-      </w:r>
-      <w:r>
-        <w:t xml:space="preserve"> (top right).</w:t>
-      </w:r>
-    </w:p>
-    <w:p>
-      <w:r>
-        <w:t xml:space="preserve">✅ </w:t>
-      </w:r>
-      <w:r>
-        <w:rPr>
-          <w:b/>
-        </w:rPr>
-        <w:t>Done when:</w:t>
-      </w:r>
-      <w:r>
-        <w:t xml:space="preserve"> the page is published again.</w:t>
-      </w:r>
-    </w:p>
-    <w:p>
-      <w:pPr>
-        <w:pStyle w:val="Heading1"/>
-      </w:pPr>
-      <w:r>
-        <w:rPr>
-          <w:color w:val="13516B"/>
-        </w:rPr>
-        <w:t>Part 5 – Quick check that it worked (5 minutes)</w:t>
-      </w:r>
-    </w:p>
-    <w:p>
-      <w:pPr>
-        <w:ind w:left="360" w:hanging="360"/>
-      </w:pPr>
-      <w:r>
-        <w:rPr>
-          <w:b/>
-        </w:rPr>
-        <w:t xml:space="preserve">☐ 1.  </w:t>
-      </w:r>
-      <w:r>
-        <w:t xml:space="preserve">Refresh the 1-to-1 page. Press </w:t>
-      </w:r>
-      <w:r>
-        <w:rPr>
-          <w:b/>
-        </w:rPr>
-        <w:t>F5</w:t>
-      </w:r>
-      <w:r>
-        <w:t xml:space="preserve">, or </w:t>
-      </w:r>
-      <w:r>
-        <w:rPr>
-          <w:b/>
-        </w:rPr>
-        <w:t>Ctrl + F5</w:t>
-      </w:r>
-      <w:r>
-        <w:t xml:space="preserve"> if it still looks old.</w:t>
-      </w:r>
-    </w:p>
-    <w:p>
-      <w:pPr>
-        <w:ind w:left="360" w:hanging="360"/>
-      </w:pPr>
-      <w:r>
-        <w:rPr>
-          <w:b/>
-        </w:rPr>
-        <w:t xml:space="preserve">☐ 2.  </w:t>
-      </w:r>
-      <w:r>
-        <w:t xml:space="preserve">Look at the </w:t>
-      </w:r>
-      <w:r>
-        <w:rPr>
-          <w:b/>
-        </w:rPr>
-        <w:t>top right</w:t>
-      </w:r>
-      <w:r>
-        <w:t xml:space="preserve"> of the dark blue bar. It should say </w:t>
-      </w:r>
-      <w:r>
-        <w:rPr>
-          <w:b/>
-        </w:rPr>
-        <w:t>v4.5.0</w:t>
-      </w:r>
-      <w:r>
-        <w:t>.</w:t>
-      </w:r>
-    </w:p>
-    <w:p>
-      <w:pPr>
-        <w:ind w:left="360" w:hanging="360"/>
-      </w:pPr>
-      <w:r>
-        <w:rPr>
-          <w:b/>
-        </w:rPr>
-        <w:t xml:space="preserve">☐ 3.  </w:t>
-      </w:r>
-      <w:r>
-        <w:t xml:space="preserve">Go to </w:t>
-      </w:r>
-      <w:r>
-        <w:rPr>
-          <w:b/>
-        </w:rPr>
-        <w:t>⚙ → Site contents</w:t>
-      </w:r>
-      <w:r>
-        <w:t xml:space="preserve">. There should now be a list called </w:t>
-      </w:r>
-      <w:r>
-        <w:rPr>
-          <w:b/>
-        </w:rPr>
-        <w:t>1-to-1 Challenges</w:t>
-      </w:r>
-      <w:r>
-        <w:t>.</w:t>
-      </w:r>
-    </w:p>
-    <w:p>
-      <w:pPr>
-        <w:ind w:left="360" w:hanging="360"/>
-      </w:pPr>
-      <w:r>
-        <w:rPr>
-          <w:b/>
-        </w:rPr>
-        <w:t xml:space="preserve">☐ 4.  </w:t>
-      </w:r>
-      <w:r>
-        <w:rPr>
-          <w:b/>
-        </w:rPr>
-        <w:t>Optional:</w:t>
-      </w:r>
-      <w:r>
-        <w:t xml:space="preserve"> ask a technician (or use a test account) to open </w:t>
-      </w:r>
-      <w:r>
-        <w:rPr>
-          <w:b/>
-        </w:rPr>
-        <w:t>This month</w:t>
-      </w:r>
-      <w:r>
-        <w:t>.</w:t>
-      </w:r>
-    </w:p>
-    <w:p>
-      <w:pPr>
-        <w:pStyle w:val="ListBullet2"/>
-      </w:pPr>
-      <w:r>
-        <w:t xml:space="preserve">Any question they haven't answered has a thin </w:t>
-      </w:r>
-      <w:r>
-        <w:rPr>
-          <w:b/>
-        </w:rPr>
-        <w:t>orange edge</w:t>
-      </w:r>
-      <w:r>
-        <w:t>.</w:t>
-      </w:r>
-    </w:p>
-    <w:p>
-      <w:pPr>
-        <w:pStyle w:val="ListBullet2"/>
-      </w:pPr>
-      <w:r>
-        <w:t xml:space="preserve">If they click </w:t>
-      </w:r>
-      <w:r>
-        <w:rPr>
-          <w:b/>
-        </w:rPr>
-        <w:t>Submit</w:t>
-      </w:r>
-      <w:r>
-        <w:t xml:space="preserve"> with something missing, it turns </w:t>
-      </w:r>
-      <w:r>
-        <w:rPr>
-          <w:b/>
-        </w:rPr>
-        <w:t>red</w:t>
-      </w:r>
-      <w:r>
-        <w:t xml:space="preserve"> and nothing is sent.</w:t>
-      </w:r>
-    </w:p>
-    <w:p>
-      <w:pPr>
-        <w:pStyle w:val="ListBullet2"/>
-      </w:pPr>
-      <w:r>
-        <w:t xml:space="preserve">On </w:t>
-      </w:r>
-      <w:r>
-        <w:rPr>
-          <w:b/>
-        </w:rPr>
-        <w:t>My appraisal</w:t>
-      </w:r>
-      <w:r>
-        <w:t xml:space="preserve"> they see words and colours, </w:t>
-      </w:r>
-      <w:r>
-        <w:rPr>
-          <w:b/>
-        </w:rPr>
-        <w:t>no scores</w:t>
-      </w:r>
-      <w:r>
-        <w:t>.</w:t>
-      </w:r>
-    </w:p>
-    <w:p>
-      <w:r>
-        <w:t xml:space="preserve">✅ </w:t>
-      </w:r>
-      <w:r>
-        <w:rPr>
-          <w:b/>
-        </w:rPr>
-        <w:t>All done</w:t>
-      </w:r>
-      <w:r>
-        <w:t xml:space="preserve"> if you see </w:t>
-      </w:r>
-      <w:r>
-        <w:rPr>
-          <w:b/>
-        </w:rPr>
-        <w:t>v4.5.0</w:t>
-      </w:r>
-      <w:r>
-        <w:t xml:space="preserve"> and the </w:t>
-      </w:r>
-      <w:r>
-        <w:rPr>
-          <w:b/>
-        </w:rPr>
-        <w:t>1-to-1 Challenges</w:t>
-      </w:r>
-      <w:r>
-        <w:t xml:space="preserve"> list.</w:t>
-      </w:r>
-    </w:p>
-    <w:p>
-      <w:pPr>
-        <w:pStyle w:val="Heading1"/>
-      </w:pPr>
-      <w:r>
-        <w:rPr>
-          <w:color w:val="13516B"/>
-        </w:rPr>
         <w:t>If something doesn't look right</w:t>
       </w:r>
     </w:p>
@@ -1498,7 +1923,7 @@
         <w:t>The import shows a red error.</w:t>
       </w:r>
       <w:r>
-        <w:t xml:space="preserve"> Take a screenshot or copy the message and send it to me. Nothing has changed yet, so it's safe to stop there.</w:t>
+        <w:t xml:space="preserve"> Take a screenshot and send it to me. Nothing has changed yet, so it's safe to stop there.</w:t>
       </w:r>
     </w:p>
     <w:p>
@@ -1529,7 +1954,7 @@
         <w:rPr>
           <w:b/>
         </w:rPr>
-        <w:t>ESG 1-to-1 | 0 Setup (run once)</w:t>
+        <w:t>0 Setup</w:t>
       </w:r>
       <w:r>
         <w:t>.</w:t>
@@ -1583,7 +2008,7 @@
         <w:t>A flow won't turn on.</w:t>
       </w:r>
       <w:r>
-        <w:t xml:space="preserve"> Make sure the Setup email (Part 2) has arrived first, then try again. If it still won't, screenshot the message.</w:t>
+        <w:t xml:space="preserve"> Make sure the Setup email has arrived, then try again. If it still won't, screenshot the message.</w:t>
       </w:r>
     </w:p>
     <w:p>
@@ -1594,7 +2019,7 @@
         <w:rPr>
           <w:b/>
         </w:rPr>
-        <w:t>The page still says v4.4.0.</w:t>
+        <w:t>The page still says v4.5.0.</w:t>
       </w:r>
     </w:p>
     <w:p>
@@ -1617,7 +2042,7 @@
         <w:t>Replace</w:t>
       </w:r>
       <w:r>
-        <w:t xml:space="preserve"> in Part 4.</w:t>
+        <w:t xml:space="preserve"> in Part 6.</w:t>
       </w:r>
     </w:p>
     <w:p>
@@ -1672,7 +2097,7 @@
         <w:t>Ctrl + F5</w:t>
       </w:r>
       <w:r>
-        <w:t xml:space="preserve"> on the page.</w:t>
+        <w:t>.</w:t>
       </w:r>
     </w:p>
     <w:p>
@@ -1683,10 +2108,10 @@
         <w:rPr>
           <w:b/>
         </w:rPr>
-        <w:t>The page says "Something went wrong".</w:t>
-      </w:r>
-      <w:r>
-        <w:t xml:space="preserve"> Screenshot it, including the version number at the top right, and send it to me.</w:t>
+        <w:t>A banner says "run 0 Setup (1.4)".</w:t>
+      </w:r>
+      <w:r>
+        <w:t xml:space="preserve"> Part 4 hasn't finished. Wait for the Setup email, then refresh the page.</w:t>
       </w:r>
     </w:p>
     <w:p>
@@ -1697,7 +2122,7 @@
         <w:rPr>
           <w:b/>
         </w:rPr>
-        <w:t>Part 2 (Setup)</w:t>
+        <w:t>Part 4 (Setup)</w:t>
       </w:r>
       <w:r>
         <w:t xml:space="preserve"> or </w:t>
@@ -1706,7 +2131,7 @@
         <w:rPr>
           <w:b/>
         </w:rPr>
-        <w:t>Part 4 (upload and Reset layout cache)</w:t>
+        <w:t>Part 6 (upload and Reset layout cache)</w:t>
       </w:r>
       <w:r>
         <w:t>. Both are safe to do again.</w:t>

</xml_diff>

<commit_message>
Docs for 5.1.0 / 1.5.0.0: migration, change log, lists, emails, guides
MIGRATION_1_5 (fresh tracker, no import; order, going back, tenant checks
T1-T14), CHANGES_5_1, lists.md sections 10-12, E19/E20 templates, simple
upgrade steps and Word copy, finalisation guide and Word copy, plan tests
F57-F68 / P31-P36 and risks R22-R26, config reference, import guide,
READMEs, reset procedure and build-sheet note.

Co-Authored-By: Claude Opus 5.5 <noreply@anthropic.com>
Claude-Session: https://claude.ai/code/session_014y1MJU3GKp2dkeyoic78UT
</commit_message>
<xml_diff>
--- a/one-to-one/ESG-1to1-Simple-Upgrade-Steps.docx
+++ b/one-to-one/ESG-1to1-Simple-Upgrade-Steps.docx
@@ -18,10 +18,19 @@
         <w:rPr>
           <w:b/>
         </w:rPr>
-        <w:t>5.0.0</w:t>
-      </w:r>
-      <w:r>
-        <w:t xml:space="preserve"> live. Here is what it brings:</w:t>
+        <w:t>5.1.0</w:t>
+      </w:r>
+      <w:r>
+        <w:t xml:space="preserve"> live. What's new in 5.1.0 – </w:t>
+      </w:r>
+      <w:r>
+        <w:rPr>
+          <w:b/>
+        </w:rPr>
+        <w:t>action tracking</w:t>
+      </w:r>
+      <w:r>
+        <w:t>:</w:t>
       </w:r>
     </w:p>
     <w:p>
@@ -29,7 +38,7 @@
         <w:pStyle w:val="ListBullet"/>
       </w:pPr>
       <w:r>
-        <w:t>appraisal periods that follow the real appraisal dates;</w:t>
+        <w:t>every agreed action has its own record, followed from month to month;</w:t>
       </w:r>
     </w:p>
     <w:p>
@@ -37,7 +46,16 @@
         <w:pStyle w:val="ListBullet"/>
       </w:pPr>
       <w:r>
-        <w:t>missed months no longer count against anyone;</w:t>
+        <w:t xml:space="preserve">technicians see their actions under </w:t>
+      </w:r>
+      <w:r>
+        <w:rPr>
+          <w:b/>
+        </w:rPr>
+        <w:t>My actions</w:t>
+      </w:r>
+      <w:r>
+        <w:t xml:space="preserve"> and can send a quick update at any time;</w:t>
       </w:r>
     </w:p>
     <w:p>
@@ -45,7 +63,16 @@
         <w:pStyle w:val="ListBullet"/>
       </w:pPr>
       <w:r>
-        <w:t>you can amend a 1-to-1 with a reason, and the person is told;</w:t>
+        <w:t xml:space="preserve">you manage every action from one </w:t>
+      </w:r>
+      <w:r>
+        <w:rPr>
+          <w:b/>
+        </w:rPr>
+        <w:t>Actions</w:t>
+      </w:r>
+      <w:r>
+        <w:t xml:space="preserve"> page: update, change the deadline (with a reason), agree or decline a close-out, close and reopen;</w:t>
       </w:r>
     </w:p>
     <w:p>
@@ -53,7 +80,7 @@
         <w:pStyle w:val="ListBullet"/>
       </w:pPr>
       <w:r>
-        <w:t>next wellbeing dates are set in Settings;</w:t>
+        <w:t>outstanding actions appear at each monthly 1-to-1, with an optional follow-up outcome;</w:t>
       </w:r>
     </w:p>
     <w:p>
@@ -61,7 +88,7 @@
         <w:pStyle w:val="ListBullet"/>
       </w:pPr>
       <w:r>
-        <w:t>no limit on expectations;</w:t>
+        <w:t>a reminder email 5 working days before each deadline;</w:t>
       </w:r>
     </w:p>
     <w:p>
@@ -69,12 +96,72 @@
         <w:pStyle w:val="ListBullet"/>
       </w:pPr>
       <w:r>
-        <w:t>a tidier screen.</w:t>
+        <w:t>the full history of every action is kept.</w:t>
       </w:r>
     </w:p>
     <w:p>
       <w:r>
-        <w:t>The old "challenge" feature is removed. Its records are kept.</w:t>
+        <w:t xml:space="preserve">If the site is still on </w:t>
+      </w:r>
+      <w:r>
+        <w:rPr>
+          <w:b/>
+        </w:rPr>
+        <w:t>4.5.0</w:t>
+      </w:r>
+      <w:r>
+        <w:t xml:space="preserve"> (5.0.0 was never installed), this also brings everything in 5.0.0:</w:t>
+      </w:r>
+    </w:p>
+    <w:p>
+      <w:pPr>
+        <w:pStyle w:val="ListBullet"/>
+      </w:pPr>
+      <w:r>
+        <w:t>appraisal periods that follow the real appraisal dates;</w:t>
+      </w:r>
+    </w:p>
+    <w:p>
+      <w:pPr>
+        <w:pStyle w:val="ListBullet"/>
+      </w:pPr>
+      <w:r>
+        <w:t>missed months no longer count against anyone;</w:t>
+      </w:r>
+    </w:p>
+    <w:p>
+      <w:pPr>
+        <w:pStyle w:val="ListBullet"/>
+      </w:pPr>
+      <w:r>
+        <w:t>amending a 1-to-1 with a reason;</w:t>
+      </w:r>
+    </w:p>
+    <w:p>
+      <w:pPr>
+        <w:pStyle w:val="ListBullet"/>
+      </w:pPr>
+      <w:r>
+        <w:t>next wellbeing dates set in Settings;</w:t>
+      </w:r>
+    </w:p>
+    <w:p>
+      <w:pPr>
+        <w:pStyle w:val="ListBullet"/>
+      </w:pPr>
+      <w:r>
+        <w:t>the old "challenge" feature removed (its records are kept).</w:t>
+      </w:r>
+    </w:p>
+    <w:p>
+      <w:r>
+        <w:rPr>
+          <w:b/>
+        </w:rPr>
+        <w:t>The action tracker starts empty.</w:t>
+      </w:r>
+      <w:r>
+        <w:t xml:space="preserve"> Actions agreed before today stay in their reviews, exactly as they are. Nothing is copied, moved or deleted. From now on, every review you complete adds its actions to the tracker automatically.</w:t>
       </w:r>
     </w:p>
     <w:p>
@@ -132,7 +219,7 @@
         <w:rPr>
           <w:b/>
         </w:rPr>
-        <w:t>ESGOneToOne_1_4_0_0_unmanaged.zip</w:t>
+        <w:t>ESGOneToOne_1_5_0_0_unmanaged.zip</w:t>
       </w:r>
       <w:r>
         <w:t xml:space="preserve"> – the "behind the scenes" part</w:t>
@@ -351,7 +438,15 @@
         <w:pStyle w:val="ListBullet2"/>
       </w:pPr>
       <w:r>
-        <w:t>1-to-1 Challenges</w:t>
+        <w:t>1-to-1 Amendments (if you have it)</w:t>
+      </w:r>
+    </w:p>
+    <w:p>
+      <w:pPr>
+        <w:pStyle w:val="ListBullet2"/>
+      </w:pPr>
+      <w:r>
+        <w:t>1-to-1 Challenges (if you have it)</w:t>
       </w:r>
     </w:p>
     <w:p>
@@ -388,7 +483,7 @@
         <w:t>Done when:</w:t>
       </w:r>
       <w:r>
-        <w:t xml:space="preserve"> you have 7 CSV files saved.</w:t>
+        <w:t xml:space="preserve"> you have a CSV file for each list.</w:t>
       </w:r>
     </w:p>
     <w:p>
@@ -399,7 +494,7 @@
         <w:rPr>
           <w:color w:val="13516B"/>
         </w:rPr>
-        <w:t>Part 2 – Switch two things off (2 minutes)</w:t>
+        <w:t>Part 2 – Switch the daily step off (2 minutes)</w:t>
       </w:r>
     </w:p>
     <w:p>
@@ -477,7 +572,7 @@
         <w:rPr>
           <w:b/>
         </w:rPr>
-        <w:t>ESG 1-to-1 | 7 Challenge</w:t>
+        <w:t>ESG 1-to-1 | 1 Daily scheduler</w:t>
       </w:r>
       <w:r>
         <w:t xml:space="preserve">, then click </w:t>
@@ -503,16 +598,13 @@
         <w:t xml:space="preserve">☐ 3.  </w:t>
       </w:r>
       <w:r>
-        <w:t xml:space="preserve">Do the same for </w:t>
-      </w:r>
-      <w:r>
         <w:rPr>
           <w:b/>
         </w:rPr>
-        <w:t>ESG 1-to-1 | 1 Daily scheduler</w:t>
-      </w:r>
-      <w:r>
-        <w:t>.</w:t>
+        <w:t>Only if you see ESG 1-to-1 | 7 Challenge:</w:t>
+      </w:r>
+      <w:r>
+        <w:t xml:space="preserve"> turn that off too.</w:t>
       </w:r>
     </w:p>
     <w:p>
@@ -526,7 +618,7 @@
         <w:t>Done when:</w:t>
       </w:r>
       <w:r>
-        <w:t xml:space="preserve"> 1 and 7 both say </w:t>
+        <w:t xml:space="preserve"> 1 (and 7, if it's there) says </w:t>
       </w:r>
       <w:r>
         <w:rPr>
@@ -630,7 +722,7 @@
         <w:rPr>
           <w:b/>
         </w:rPr>
-        <w:t>ESGOneToOne_1_4_0_0_unmanaged.zip</w:t>
+        <w:t>ESGOneToOne_1_5_0_0_unmanaged.zip</w:t>
       </w:r>
       <w:r>
         <w:t xml:space="preserve"> and double-click it.</w:t>
@@ -819,16 +911,34 @@
     </w:p>
     <w:p>
       <w:r>
-        <w:t xml:space="preserve">This adds the new columns and the new </w:t>
+        <w:t>This adds the three new action lists (</w:t>
       </w:r>
       <w:r>
         <w:rPr>
           <w:b/>
         </w:rPr>
-        <w:t>1-to-1 Amendments</w:t>
-      </w:r>
-      <w:r>
-        <w:t xml:space="preserve"> list. It also closes off the old challenges list. It never deletes anything.</w:t>
+        <w:t>1-to-1 Actions</w:t>
+      </w:r>
+      <w:r>
+        <w:t xml:space="preserve">, </w:t>
+      </w:r>
+      <w:r>
+        <w:rPr>
+          <w:b/>
+        </w:rPr>
+        <w:t>1-to-1 Action Updates</w:t>
+      </w:r>
+      <w:r>
+        <w:t xml:space="preserve">, </w:t>
+      </w:r>
+      <w:r>
+        <w:rPr>
+          <w:b/>
+        </w:rPr>
+        <w:t>1-to-1 Action Notices</w:t>
+      </w:r>
+      <w:r>
+        <w:t>), and one new column. It records today as the day action tracking started. It never deletes anything.</w:t>
       </w:r>
     </w:p>
     <w:p>
@@ -1133,10 +1243,70 @@
         <w:rPr>
           <w:b/>
         </w:rPr>
-        <w:t>8 Amendment notice</w:t>
-      </w:r>
-      <w:r>
-        <w:t xml:space="preserve"> (this one is new)</w:t>
+        <w:t>8</w:t>
+      </w:r>
+      <w:r>
+        <w:t xml:space="preserve"> Amendment notice</w:t>
+      </w:r>
+    </w:p>
+    <w:p>
+      <w:pPr>
+        <w:ind w:left="720" w:hanging="360"/>
+      </w:pPr>
+      <w:r>
+        <w:rPr>
+          <w:b/>
+        </w:rPr>
+        <w:t xml:space="preserve">☐ 7.  </w:t>
+      </w:r>
+      <w:r>
+        <w:rPr>
+          <w:b/>
+        </w:rPr>
+        <w:t>9 Action access</w:t>
+      </w:r>
+      <w:r>
+        <w:t xml:space="preserve"> (new)</w:t>
+      </w:r>
+    </w:p>
+    <w:p>
+      <w:pPr>
+        <w:ind w:left="720" w:hanging="360"/>
+      </w:pPr>
+      <w:r>
+        <w:rPr>
+          <w:b/>
+        </w:rPr>
+        <w:t xml:space="preserve">☐ 8.  </w:t>
+      </w:r>
+      <w:r>
+        <w:rPr>
+          <w:b/>
+        </w:rPr>
+        <w:t>10 Action update</w:t>
+      </w:r>
+      <w:r>
+        <w:t xml:space="preserve"> (new)</w:t>
+      </w:r>
+    </w:p>
+    <w:p>
+      <w:pPr>
+        <w:ind w:left="720" w:hanging="360"/>
+      </w:pPr>
+      <w:r>
+        <w:rPr>
+          <w:b/>
+        </w:rPr>
+        <w:t xml:space="preserve">☐ 9.  </w:t>
+      </w:r>
+      <w:r>
+        <w:rPr>
+          <w:b/>
+        </w:rPr>
+        <w:t>11 Action notice</w:t>
+      </w:r>
+      <w:r>
+        <w:t xml:space="preserve"> (new)</w:t>
       </w:r>
     </w:p>
     <w:p>
@@ -1153,10 +1323,10 @@
         <w:rPr>
           <w:b/>
         </w:rPr>
-        <w:t>Leave 1 and 7 off for now.</w:t>
-      </w:r>
-      <w:r>
-        <w:t xml:space="preserve"> Leave </w:t>
+        <w:t>Leave 1 off for now</w:t>
+      </w:r>
+      <w:r>
+        <w:t xml:space="preserve"> (and 7, if it's there). Leave </w:t>
       </w:r>
       <w:r>
         <w:rPr>
@@ -1179,7 +1349,7 @@
         <w:t>Done when:</w:t>
       </w:r>
       <w:r>
-        <w:t xml:space="preserve"> 2, 3, 4, 5, 6 and 8 say </w:t>
+        <w:t xml:space="preserve"> 2, 3, 4, 5, 6, 8, 9, 10 and 11 say </w:t>
       </w:r>
       <w:r>
         <w:rPr>
@@ -1188,7 +1358,7 @@
         <w:t>On</w:t>
       </w:r>
       <w:r>
-        <w:t xml:space="preserve">, and 1 and 7 say </w:t>
+        <w:t xml:space="preserve">, and 1 says </w:t>
       </w:r>
       <w:r>
         <w:rPr>
@@ -1480,7 +1650,7 @@
         <w:rPr>
           <w:b/>
         </w:rPr>
-        <w:t>v5.0.0</w:t>
+        <w:t>v5.1.0</w:t>
       </w:r>
       <w:r>
         <w:t>.</w:t>
@@ -1503,7 +1673,25 @@
         <w:rPr>
           <w:b/>
         </w:rPr>
-        <w:t>v5.0.0</w:t>
+        <w:t>v5.1.0</w:t>
+      </w:r>
+      <w:r>
+        <w:t xml:space="preserve">, and the </w:t>
+      </w:r>
+      <w:r>
+        <w:rPr>
+          <w:b/>
+        </w:rPr>
+        <w:t>Actions</w:t>
+      </w:r>
+      <w:r>
+        <w:t xml:space="preserve"> page shows the row of tiles starting </w:t>
+      </w:r>
+      <w:r>
+        <w:rPr>
+          <w:b/>
+        </w:rPr>
+        <w:t>Awaiting close-out</w:t>
       </w:r>
       <w:r>
         <w:t>.</w:t>
@@ -1517,12 +1705,12 @@
         <w:rPr>
           <w:color w:val="13516B"/>
         </w:rPr>
-        <w:t>Part 7 – Enter everyone's dates (10 minutes)</w:t>
+        <w:t>Part 7 – Only if you came from 4.5.0: enter everyone's dates (10 minutes)</w:t>
       </w:r>
     </w:p>
     <w:p>
       <w:r>
-        <w:t>The page never guesses dates. You enter them once, and after that they only change when you change them.</w:t>
+        <w:t>Skip this part if 5.0.0 was already installed and the dates are in.</w:t>
       </w:r>
     </w:p>
     <w:p>
@@ -1747,6 +1935,177 @@
         <w:rPr>
           <w:color w:val="13516B"/>
         </w:rPr>
+        <w:t>Part 9 – A quick check with a test person (10 minutes)</w:t>
+      </w:r>
+    </w:p>
+    <w:p>
+      <w:pPr>
+        <w:ind w:left="360" w:hanging="360"/>
+      </w:pPr>
+      <w:r>
+        <w:rPr>
+          <w:b/>
+        </w:rPr>
+        <w:t xml:space="preserve">☐ 1.  </w:t>
+      </w:r>
+      <w:r>
+        <w:t xml:space="preserve">Complete a test 1-to-1 that has one action. After a few minutes, it appears on the </w:t>
+      </w:r>
+      <w:r>
+        <w:rPr>
+          <w:b/>
+        </w:rPr>
+        <w:t>Actions</w:t>
+      </w:r>
+      <w:r>
+        <w:t xml:space="preserve"> page.</w:t>
+      </w:r>
+    </w:p>
+    <w:p>
+      <w:pPr>
+        <w:ind w:left="360" w:hanging="360"/>
+      </w:pPr>
+      <w:r>
+        <w:rPr>
+          <w:b/>
+        </w:rPr>
+        <w:t xml:space="preserve">☐ 2.  </w:t>
+      </w:r>
+      <w:r>
+        <w:t xml:space="preserve">As the test person, open </w:t>
+      </w:r>
+      <w:r>
+        <w:rPr>
+          <w:b/>
+        </w:rPr>
+        <w:t>My actions</w:t>
+      </w:r>
+      <w:r>
+        <w:t xml:space="preserve">, type an update and click </w:t>
+      </w:r>
+      <w:r>
+        <w:rPr>
+          <w:b/>
+        </w:rPr>
+        <w:t>Send update</w:t>
+      </w:r>
+      <w:r>
+        <w:t xml:space="preserve">. It says </w:t>
+      </w:r>
+      <w:r>
+        <w:rPr>
+          <w:i/>
+        </w:rPr>
+        <w:t>received – being recorded</w:t>
+      </w:r>
+      <w:r>
+        <w:t xml:space="preserve">, then </w:t>
+      </w:r>
+      <w:r>
+        <w:rPr>
+          <w:b/>
+        </w:rPr>
+        <w:t>recorded ✓</w:t>
+      </w:r>
+      <w:r>
+        <w:t xml:space="preserve"> within about 5 minutes.</w:t>
+      </w:r>
+    </w:p>
+    <w:p>
+      <w:pPr>
+        <w:ind w:left="360" w:hanging="360"/>
+      </w:pPr>
+      <w:r>
+        <w:rPr>
+          <w:b/>
+        </w:rPr>
+        <w:t xml:space="preserve">☐ 3.  </w:t>
+      </w:r>
+      <w:r>
+        <w:t xml:space="preserve">As the test person, click </w:t>
+      </w:r>
+      <w:r>
+        <w:rPr>
+          <w:b/>
+        </w:rPr>
+        <w:t>Ready to close…</w:t>
+      </w:r>
+      <w:r>
+        <w:t xml:space="preserve"> then </w:t>
+      </w:r>
+      <w:r>
+        <w:rPr>
+          <w:b/>
+        </w:rPr>
+        <w:t>Ask to close</w:t>
+      </w:r>
+      <w:r>
+        <w:t xml:space="preserve">. You get one email: </w:t>
+      </w:r>
+      <w:r>
+        <w:rPr>
+          <w:i/>
+        </w:rPr>
+        <w:t>Close-out requested</w:t>
+      </w:r>
+      <w:r>
+        <w:t>.</w:t>
+      </w:r>
+    </w:p>
+    <w:p>
+      <w:pPr>
+        <w:ind w:left="360" w:hanging="360"/>
+      </w:pPr>
+      <w:r>
+        <w:rPr>
+          <w:b/>
+        </w:rPr>
+        <w:t xml:space="preserve">☐ 4.  </w:t>
+      </w:r>
+      <w:r>
+        <w:t xml:space="preserve">On the </w:t>
+      </w:r>
+      <w:r>
+        <w:rPr>
+          <w:b/>
+        </w:rPr>
+        <w:t>Actions</w:t>
+      </w:r>
+      <w:r>
+        <w:t xml:space="preserve"> page, click </w:t>
+      </w:r>
+      <w:r>
+        <w:rPr>
+          <w:b/>
+        </w:rPr>
+        <w:t>Agree &amp; close</w:t>
+      </w:r>
+      <w:r>
+        <w:t>.</w:t>
+      </w:r>
+    </w:p>
+    <w:p>
+      <w:r>
+        <w:t xml:space="preserve">✅ </w:t>
+      </w:r>
+      <w:r>
+        <w:rPr>
+          <w:b/>
+        </w:rPr>
+        <w:t>Done when:</w:t>
+      </w:r>
+      <w:r>
+        <w:t xml:space="preserve"> all four worked. The full list of checks is in `MIGRATION_1_5.md` (T1–T14).</w:t>
+      </w:r>
+    </w:p>
+    <w:p>
+      <w:pPr>
+        <w:pStyle w:val="Heading1"/>
+      </w:pPr>
+      <w:r>
+        <w:rPr>
+          <w:color w:val="13516B"/>
+        </w:rPr>
         <w:t>Later, with separate approval</w:t>
       </w:r>
     </w:p>
@@ -1770,7 +2129,7 @@
         <w:t>RESET_PROCEDURE.md</w:t>
       </w:r>
       <w:r>
-        <w:t>. It has its own steps and safety checks.</w:t>
+        <w:t>. It has its own steps and safety checks. Deleting tracked actions needs its own separate approval and its own tick box.</w:t>
       </w:r>
     </w:p>
     <w:p>
@@ -1781,10 +2140,10 @@
         <w:rPr>
           <w:b/>
         </w:rPr>
-        <w:t>Removing the old challenge step.</w:t>
-      </w:r>
-      <w:r>
-        <w:t xml:space="preserve"> When you're happy everything works, delete </w:t>
+        <w:t>Removing the old challenge step</w:t>
+      </w:r>
+      <w:r>
+        <w:t xml:space="preserve"> (only if you came from 4.5.0). When you're happy everything works, delete </w:t>
       </w:r>
       <w:r>
         <w:rPr>
@@ -1813,7 +2172,7 @@
         <w:rPr>
           <w:color w:val="13516B"/>
         </w:rPr>
-        <w:t>How the new bits work, day to day</w:t>
+        <w:t>How action tracking works, day to day</w:t>
       </w:r>
     </w:p>
     <w:p>
@@ -1824,19 +2183,19 @@
         <w:rPr>
           <w:b/>
         </w:rPr>
-        <w:t>An appraisal has happened.</w:t>
-      </w:r>
-      <w:r>
-        <w:t xml:space="preserve"> Go to </w:t>
+        <w:t>At a monthly 1-to-1.</w:t>
+      </w:r>
+      <w:r>
+        <w:t xml:space="preserve"> Add the agreed actions as before: action, owner, close-out criteria, deadline. When you click </w:t>
       </w:r>
       <w:r>
         <w:rPr>
           <w:b/>
         </w:rPr>
-        <w:t>⚙ Settings → Team → Mark appraisal completed…</w:t>
-      </w:r>
-      <w:r>
-        <w:t xml:space="preserve"> and enter the date it actually happened and the next due date. The person's new period starts with fresh ratings. The old period stays in their history and reports.</w:t>
+        <w:t>Complete &amp; release</w:t>
+      </w:r>
+      <w:r>
+        <w:t>, they go into the tracker by themselves.</w:t>
       </w:r>
     </w:p>
     <w:p>
@@ -1847,44 +2206,37 @@
         <w:rPr>
           <w:b/>
         </w:rPr>
-        <w:t>Changing a 1-to-1 after it's done.</w:t>
-      </w:r>
-      <w:r>
-        <w:t xml:space="preserve"> Open it and click </w:t>
+        <w:t>Outstanding actions</w:t>
+      </w:r>
+      <w:r>
+        <w:t xml:space="preserve"> shows on the review. It lists everything still open from earlier months, and what has changed since the last review. You can record an outcome if you want: </w:t>
       </w:r>
       <w:r>
         <w:rPr>
-          <w:b/>
+          <w:i/>
         </w:rPr>
-        <w:t>Amend…</w:t>
-      </w:r>
-      <w:r>
-        <w:t xml:space="preserve">. Change what's needed, then click </w:t>
+        <w:t>Progress satisfactory</w:t>
+      </w:r>
+      <w:r>
+        <w:t xml:space="preserve">, </w:t>
       </w:r>
       <w:r>
         <w:rPr>
-          <w:b/>
+          <w:i/>
         </w:rPr>
-        <w:t>Save amendment…</w:t>
-      </w:r>
-      <w:r>
-        <w:t xml:space="preserve"> and give a reason.</w:t>
-      </w:r>
-    </w:p>
-    <w:p>
-      <w:pPr>
-        <w:pStyle w:val="ListBullet2"/>
-      </w:pPr>
-      <w:r>
-        <w:t>The person is emailed that it was amended. The email doesn't say what changed or why.</w:t>
-      </w:r>
-    </w:p>
-    <w:p>
-      <w:pPr>
-        <w:pStyle w:val="ListBullet2"/>
-      </w:pPr>
-      <w:r>
-        <w:t>Only you can see the before and after.</w:t>
+        <w:t>Further support required</w:t>
+      </w:r>
+      <w:r>
+        <w:t xml:space="preserve"> or </w:t>
+      </w:r>
+      <w:r>
+        <w:rPr>
+          <w:i/>
+        </w:rPr>
+        <w:t>Ready to close</w:t>
+      </w:r>
+      <w:r>
+        <w:t>.</w:t>
       </w:r>
     </w:p>
     <w:p>
@@ -1895,10 +2247,111 @@
         <w:rPr>
           <w:b/>
         </w:rPr>
-        <w:t>Completing a wellbeing assessment.</w:t>
-      </w:r>
-      <w:r>
-        <w:t xml:space="preserve"> You'll be asked to confirm, or set, the next wellbeing date.</w:t>
+        <w:t>Between meetings.</w:t>
+      </w:r>
+      <w:r>
+        <w:t xml:space="preserve"> Technicians send updates from </w:t>
+      </w:r>
+      <w:r>
+        <w:rPr>
+          <w:b/>
+        </w:rPr>
+        <w:t>My actions</w:t>
+      </w:r>
+      <w:r>
+        <w:t xml:space="preserve">. They can say an action is </w:t>
+      </w:r>
+      <w:r>
+        <w:rPr>
+          <w:b/>
+        </w:rPr>
+        <w:t>waiting on something</w:t>
+      </w:r>
+      <w:r>
+        <w:t xml:space="preserve"> (the deadline stays the same) or, on their own actions, ask you to close it. You get an email when they ask.</w:t>
+      </w:r>
+    </w:p>
+    <w:p>
+      <w:pPr>
+        <w:pStyle w:val="ListBullet"/>
+      </w:pPr>
+      <w:r>
+        <w:rPr>
+          <w:b/>
+        </w:rPr>
+        <w:t>The Actions page.</w:t>
+      </w:r>
+      <w:r>
+        <w:t xml:space="preserve"> The tiles at the top show what needs you: close-out requests, overdue, due soon, waiting, no recent progress, problems. Click </w:t>
+      </w:r>
+      <w:r>
+        <w:rPr>
+          <w:b/>
+        </w:rPr>
+        <w:t>Update…</w:t>
+      </w:r>
+      <w:r>
+        <w:t xml:space="preserve"> on any action to add a note, change the status, move the deadline (with a reason – the original is kept) or change the owner.</w:t>
+      </w:r>
+    </w:p>
+    <w:p>
+      <w:pPr>
+        <w:pStyle w:val="ListBullet"/>
+      </w:pPr>
+      <w:r>
+        <w:rPr>
+          <w:b/>
+        </w:rPr>
+        <w:t>Only you close actions.</w:t>
+      </w:r>
+      <w:r>
+        <w:t xml:space="preserve"> You can close any action, and reopen one with a reason.</w:t>
+      </w:r>
+    </w:p>
+    <w:p>
+      <w:pPr>
+        <w:pStyle w:val="ListBullet"/>
+      </w:pPr>
+      <w:r>
+        <w:rPr>
+          <w:b/>
+        </w:rPr>
+        <w:t>Reminders.</w:t>
+      </w:r>
+      <w:r>
+        <w:t xml:space="preserve"> The technician gets an email 5 working days before a deadline, and you get a copy. There are no overdue emails; overdue actions show in </w:t>
+      </w:r>
+      <w:r>
+        <w:rPr>
+          <w:b/>
+        </w:rPr>
+        <w:t>Needs your attention</w:t>
+      </w:r>
+      <w:r>
+        <w:t>.</w:t>
+      </w:r>
+    </w:p>
+    <w:p>
+      <w:pPr>
+        <w:pStyle w:val="ListBullet"/>
+      </w:pPr>
+      <w:r>
+        <w:rPr>
+          <w:b/>
+        </w:rPr>
+        <w:t>An appraisal has happened.</w:t>
+      </w:r>
+      <w:r>
+        <w:t xml:space="preserve"> Go to </w:t>
+      </w:r>
+      <w:r>
+        <w:rPr>
+          <w:b/>
+        </w:rPr>
+        <w:t>⚙ Settings → Team → Mark appraisal completed…</w:t>
+      </w:r>
+      <w:r>
+        <w:t>. Actions are not affected: open ones carry on.</w:t>
       </w:r>
     </w:p>
     <w:p>
@@ -2019,7 +2472,7 @@
         <w:rPr>
           <w:b/>
         </w:rPr>
-        <w:t>The page still says v4.5.0.</w:t>
+        <w:t>The page still shows an older version number.</w:t>
       </w:r>
     </w:p>
     <w:p>
@@ -2108,10 +2561,60 @@
         <w:rPr>
           <w:b/>
         </w:rPr>
-        <w:t>A banner says "run 0 Setup (1.4)".</w:t>
+        <w:t>A banner says "run 0 Setup (1.5)".</w:t>
       </w:r>
       <w:r>
         <w:t xml:space="preserve"> Part 4 hasn't finished. Wait for the Setup email, then refresh the page.</w:t>
+      </w:r>
+    </w:p>
+    <w:p>
+      <w:pPr>
+        <w:pStyle w:val="ListBullet"/>
+      </w:pPr>
+      <w:r>
+        <w:rPr>
+          <w:b/>
+        </w:rPr>
+        <w:t>Needs your attention says an action "isn't shared" or an update "isn't recorded".</w:t>
+      </w:r>
+      <w:r>
+        <w:t xml:space="preserve"> Check that </w:t>
+      </w:r>
+      <w:r>
+        <w:rPr>
+          <w:b/>
+        </w:rPr>
+        <w:t>9 Action access</w:t>
+      </w:r>
+      <w:r>
+        <w:t xml:space="preserve"> and </w:t>
+      </w:r>
+      <w:r>
+        <w:rPr>
+          <w:b/>
+        </w:rPr>
+        <w:t>10 Action update</w:t>
+      </w:r>
+      <w:r>
+        <w:t xml:space="preserve"> are </w:t>
+      </w:r>
+      <w:r>
+        <w:rPr>
+          <w:b/>
+        </w:rPr>
+        <w:t>On</w:t>
+      </w:r>
+      <w:r>
+        <w:t xml:space="preserve">. Then click </w:t>
+      </w:r>
+      <w:r>
+        <w:rPr>
+          <w:b/>
+        </w:rPr>
+        <w:t>Repair</w:t>
+      </w:r>
+      <w:r>
+        <w:t xml:space="preserve"> (for sharing).</w:t>
       </w:r>
     </w:p>
     <w:p>

</xml_diff>